<commit_message>
Edit BZ, RTZ, KP
</commit_message>
<xml_diff>
--- a/docs/Word/RTZ.docx
+++ b/docs/Word/RTZ.docx
@@ -496,7 +496,15 @@
                 <w:sz w:val="36"/>
                 <w:szCs w:val="36"/>
               </w:rPr>
-              <w:t>Тестер компонентов</w:t>
+              <w:t>Тестер</w:t>
+            </w:r>
+            <w:r>
+              <w:rPr>
+                <w:color w:val="000000" w:themeColor="text1"/>
+                <w:sz w:val="36"/>
+                <w:szCs w:val="36"/>
+              </w:rPr>
+              <w:t xml:space="preserve"> компонентов на базе микроконтроллера STM32</w:t>
             </w:r>
             <w:r>
               <w:rPr>
@@ -572,13 +580,11 @@
       <w:r>
         <w:t xml:space="preserve">Дата выдачи задания </w:t>
       </w:r>
-      <w:proofErr w:type="gramStart"/>
-      <w:r>
-        <w:t>« _</w:t>
-      </w:r>
-      <w:proofErr w:type="gramEnd"/>
-      <w:r>
-        <w:t>__ » ____________ 20__ г.</w:t>
+      <w:r>
+        <w:t>«_</w:t>
+      </w:r>
+      <w:r>
+        <w:t>__» ____________ 20__ г.</w:t>
       </w:r>
     </w:p>
     <w:p>
@@ -854,15 +860,22 @@
     </w:tbl>
     <w:p>
       <w:pPr>
-        <w:pStyle w:val="21"/>
-        <w:spacing w:after="120" w:line="360" w:lineRule="auto"/>
-        <w:ind w:left="0" w:firstLine="0"/>
-        <w:rPr>
+        <w:spacing w:line="240" w:lineRule="auto"/>
+        <w:ind w:firstLine="0"/>
+        <w:rPr>
+          <w:rFonts w:eastAsia="Times New Roman" w:cs="Times New Roman"/>
           <w:b/>
-          <w:sz w:val="28"/>
           <w:szCs w:val="28"/>
-        </w:rPr>
-      </w:pPr>
+          <w:lang w:eastAsia="ru-RU"/>
+        </w:rPr>
+      </w:pPr>
+      <w:r>
+        <w:rPr>
+          <w:b/>
+          <w:szCs w:val="28"/>
+        </w:rPr>
+        <w:br w:type="page"/>
+      </w:r>
     </w:p>
     <w:p>
       <w:pPr>
@@ -890,113 +903,56 @@
       <w:pPr>
         <w:jc w:val="both"/>
         <w:rPr>
-          <w:szCs w:val="28"/>
-        </w:rPr>
-      </w:pPr>
-      <w:r>
-        <w:rPr>
-          <w:szCs w:val="28"/>
+          <w:sz w:val="27"/>
+          <w:szCs w:val="27"/>
+        </w:rPr>
+      </w:pPr>
+      <w:r>
+        <w:rPr>
+          <w:sz w:val="27"/>
+          <w:szCs w:val="27"/>
         </w:rPr>
         <w:t xml:space="preserve">Настоящее техническое задание распространяется на разработку </w:t>
       </w:r>
       <w:r>
         <w:rPr>
-          <w:szCs w:val="28"/>
+          <w:sz w:val="27"/>
+          <w:szCs w:val="27"/>
         </w:rPr>
         <w:t xml:space="preserve">устройства </w:t>
       </w:r>
       <w:r>
         <w:rPr>
-          <w:szCs w:val="28"/>
+          <w:sz w:val="27"/>
+          <w:szCs w:val="27"/>
         </w:rPr>
         <w:t>«</w:t>
       </w:r>
       <w:r>
         <w:rPr>
-          <w:szCs w:val="28"/>
-        </w:rPr>
-        <w:t>Тестер компонентов</w:t>
-      </w:r>
-      <w:r>
-        <w:rPr>
-          <w:szCs w:val="28"/>
+          <w:sz w:val="27"/>
+          <w:szCs w:val="27"/>
+        </w:rPr>
+        <w:t>Тестер</w:t>
+      </w:r>
+      <w:r>
+        <w:rPr>
+          <w:sz w:val="27"/>
+          <w:szCs w:val="27"/>
+        </w:rPr>
+        <w:t xml:space="preserve"> компонентов на базе микроконтроллера STM32</w:t>
+      </w:r>
+      <w:r>
+        <w:rPr>
+          <w:sz w:val="27"/>
+          <w:szCs w:val="27"/>
         </w:rPr>
         <w:t>»</w:t>
       </w:r>
       <w:r>
         <w:rPr>
-          <w:szCs w:val="28"/>
-        </w:rPr>
-        <w:t xml:space="preserve"> </w:t>
-      </w:r>
-      <w:r>
-        <w:rPr>
-          <w:szCs w:val="28"/>
-          <w:lang w:val="en-US"/>
-        </w:rPr>
-        <w:t>c</w:t>
-      </w:r>
-      <w:r>
-        <w:rPr>
-          <w:szCs w:val="28"/>
-        </w:rPr>
-        <w:t xml:space="preserve"> </w:t>
-      </w:r>
-      <w:r>
-        <w:rPr>
-          <w:szCs w:val="28"/>
-          <w:lang w:val="en-US"/>
-        </w:rPr>
-        <w:t>STM</w:t>
-      </w:r>
-      <w:r>
-        <w:rPr>
-          <w:szCs w:val="28"/>
-        </w:rPr>
-        <w:t>32</w:t>
-      </w:r>
-      <w:r>
-        <w:rPr>
-          <w:szCs w:val="28"/>
-          <w:lang w:val="en-US"/>
-        </w:rPr>
-        <w:t>F</w:t>
-      </w:r>
-      <w:r>
-        <w:rPr>
-          <w:szCs w:val="28"/>
-        </w:rPr>
-        <w:t>103</w:t>
-      </w:r>
-      <w:r>
-        <w:rPr>
-          <w:szCs w:val="28"/>
-          <w:lang w:val="en-US"/>
-        </w:rPr>
-        <w:t>C</w:t>
-      </w:r>
-      <w:r>
-        <w:rPr>
-          <w:szCs w:val="28"/>
-        </w:rPr>
-        <w:t>8</w:t>
-      </w:r>
-      <w:r>
-        <w:rPr>
-          <w:szCs w:val="28"/>
-          <w:lang w:val="en-US"/>
-        </w:rPr>
-        <w:t>T</w:t>
-      </w:r>
-      <w:r>
-        <w:rPr>
-          <w:szCs w:val="28"/>
-        </w:rPr>
-        <w:t>6</w:t>
-      </w:r>
-      <w:r>
-        <w:rPr>
-          <w:szCs w:val="28"/>
+          <w:sz w:val="27"/>
+          <w:szCs w:val="27"/>
         </w:rPr>
         <w:t>.</w:t>
       </w:r>
@@ -1004,7 +960,7 @@
     <w:p>
       <w:pPr>
         <w:pStyle w:val="21"/>
-        <w:spacing w:before="120" w:after="120" w:line="276" w:lineRule="auto"/>
+        <w:spacing w:before="120" w:after="120" w:line="360" w:lineRule="auto"/>
         <w:ind w:left="0" w:firstLine="709"/>
         <w:jc w:val="both"/>
         <w:rPr>
@@ -1034,36 +990,28 @@
       <w:pPr>
         <w:jc w:val="both"/>
         <w:rPr>
-          <w:szCs w:val="28"/>
-        </w:rPr>
-      </w:pPr>
-      <w:r>
-        <w:rPr>
-          <w:szCs w:val="28"/>
-        </w:rPr>
-        <w:t xml:space="preserve">Основанием для выполнение курсовой работы по предмету «Схемотехника электронных средств» является задание кафедры ИУ4 «Проектирование и технология производства электронной аппаратуры» в соответствии с учебным планом специальности </w:t>
-      </w:r>
-      <w:r>
-        <w:rPr>
-          <w:szCs w:val="28"/>
-        </w:rPr>
-        <w:t>11.03.03</w:t>
-      </w:r>
-      <w:r>
-        <w:rPr>
-          <w:szCs w:val="28"/>
-        </w:rPr>
-        <w:t xml:space="preserve"> «</w:t>
-      </w:r>
-      <w:r>
-        <w:rPr>
-          <w:szCs w:val="28"/>
-        </w:rPr>
-        <w:t>Проектирование и технология производства электронной аппаратуры</w:t>
-      </w:r>
-      <w:r>
-        <w:rPr>
-          <w:szCs w:val="28"/>
+          <w:sz w:val="27"/>
+          <w:szCs w:val="27"/>
+        </w:rPr>
+      </w:pPr>
+      <w:r>
+        <w:rPr>
+          <w:sz w:val="27"/>
+          <w:szCs w:val="27"/>
+        </w:rPr>
+        <w:t>Основанием для выполнение курсовой работы по предмету «Схемотехника электронных средств» является задание кафедры ИУ4 «Проектирование и технология производства электронной аппаратуры» в соответствии с учебным планом специальности 11.03.03 «</w:t>
+      </w:r>
+      <w:r>
+        <w:rPr>
+          <w:sz w:val="27"/>
+          <w:szCs w:val="27"/>
+        </w:rPr>
+        <w:t>Конструирование и технология электронных средств</w:t>
+      </w:r>
+      <w:r>
+        <w:rPr>
+          <w:sz w:val="27"/>
+          <w:szCs w:val="27"/>
         </w:rPr>
         <w:t>» (бакалавр).</w:t>
       </w:r>
@@ -1071,7 +1019,7 @@
     <w:p>
       <w:pPr>
         <w:pStyle w:val="21"/>
-        <w:spacing w:before="120" w:after="120" w:line="276" w:lineRule="auto"/>
+        <w:spacing w:before="120" w:after="120" w:line="360" w:lineRule="auto"/>
         <w:ind w:left="0" w:firstLine="709"/>
         <w:jc w:val="both"/>
         <w:rPr>
@@ -1101,78 +1049,77 @@
       <w:pPr>
         <w:jc w:val="both"/>
         <w:rPr>
-          <w:szCs w:val="28"/>
-        </w:rPr>
-      </w:pPr>
-      <w:r>
-        <w:rPr>
-          <w:szCs w:val="28"/>
+          <w:sz w:val="27"/>
+          <w:szCs w:val="27"/>
+        </w:rPr>
+      </w:pPr>
+      <w:r>
+        <w:rPr>
+          <w:sz w:val="27"/>
+          <w:szCs w:val="27"/>
         </w:rPr>
         <w:t xml:space="preserve">Целью выполнения </w:t>
       </w:r>
       <w:r>
         <w:rPr>
-          <w:szCs w:val="28"/>
+          <w:sz w:val="27"/>
+          <w:szCs w:val="27"/>
         </w:rPr>
         <w:t>курсовой</w:t>
       </w:r>
       <w:r>
         <w:rPr>
-          <w:szCs w:val="28"/>
+          <w:sz w:val="27"/>
+          <w:szCs w:val="27"/>
         </w:rPr>
         <w:t xml:space="preserve"> работы является разработка конструкторской документации, разработка и изготовление опытного образца </w:t>
       </w:r>
       <w:r>
         <w:rPr>
-          <w:szCs w:val="28"/>
+          <w:sz w:val="27"/>
+          <w:szCs w:val="27"/>
         </w:rPr>
         <w:t xml:space="preserve">устройства </w:t>
       </w:r>
       <w:r>
         <w:rPr>
-          <w:szCs w:val="28"/>
+          <w:sz w:val="27"/>
+          <w:szCs w:val="27"/>
         </w:rPr>
         <w:t>«</w:t>
       </w:r>
       <w:r>
         <w:rPr>
-          <w:szCs w:val="28"/>
-        </w:rPr>
-        <w:t>Т</w:t>
-      </w:r>
-      <w:r>
-        <w:rPr>
-          <w:szCs w:val="28"/>
-        </w:rPr>
-        <w:t>естер компонентов</w:t>
-      </w:r>
-      <w:r>
-        <w:rPr>
-          <w:szCs w:val="28"/>
+          <w:sz w:val="27"/>
+          <w:szCs w:val="27"/>
+        </w:rPr>
+        <w:t>Тестер компонентов на базе микроконтроллера STM32</w:t>
+      </w:r>
+      <w:r>
+        <w:rPr>
+          <w:sz w:val="27"/>
+          <w:szCs w:val="27"/>
         </w:rPr>
         <w:t>»</w:t>
       </w:r>
       <w:r>
         <w:rPr>
-          <w:szCs w:val="28"/>
-        </w:rPr>
-        <w:t>.</w:t>
-      </w:r>
-      <w:r>
-        <w:rPr>
-          <w:szCs w:val="28"/>
-        </w:rPr>
-        <w:t xml:space="preserve"> Разрабатываемое устройство предназначено для </w:t>
-      </w:r>
-      <w:r>
-        <w:rPr>
-          <w:szCs w:val="28"/>
+          <w:sz w:val="27"/>
+          <w:szCs w:val="27"/>
+        </w:rPr>
+        <w:t xml:space="preserve">. Разрабатываемое устройство предназначено для </w:t>
+      </w:r>
+      <w:r>
+        <w:rPr>
+          <w:sz w:val="27"/>
+          <w:szCs w:val="27"/>
         </w:rPr>
         <w:t>проверки работоспособности радиоэлектронных компонентов</w:t>
       </w:r>
       <w:r>
         <w:rPr>
-          <w:szCs w:val="28"/>
+          <w:sz w:val="27"/>
+          <w:szCs w:val="27"/>
         </w:rPr>
         <w:t>.</w:t>
       </w:r>
@@ -1181,12 +1128,14 @@
       <w:pPr>
         <w:jc w:val="both"/>
         <w:rPr>
-          <w:szCs w:val="28"/>
-        </w:rPr>
-      </w:pPr>
-      <w:r>
-        <w:rPr>
-          <w:szCs w:val="28"/>
+          <w:sz w:val="27"/>
+          <w:szCs w:val="27"/>
+        </w:rPr>
+      </w:pPr>
+      <w:r>
+        <w:rPr>
+          <w:sz w:val="27"/>
+          <w:szCs w:val="27"/>
         </w:rPr>
         <w:t>В ходе выполнения курсовой работы должны быть решены следующие задачи:</w:t>
       </w:r>
@@ -1195,52 +1144,52 @@
       <w:pPr>
         <w:jc w:val="both"/>
         <w:rPr>
-          <w:szCs w:val="28"/>
-        </w:rPr>
-      </w:pPr>
-      <w:r>
-        <w:rPr>
-          <w:szCs w:val="28"/>
+          <w:sz w:val="27"/>
+          <w:szCs w:val="27"/>
+        </w:rPr>
+      </w:pPr>
+      <w:r>
+        <w:rPr>
+          <w:sz w:val="27"/>
+          <w:szCs w:val="27"/>
         </w:rPr>
         <w:t>1.</w:t>
       </w:r>
       <w:r>
         <w:rPr>
-          <w:szCs w:val="28"/>
+          <w:sz w:val="27"/>
+          <w:szCs w:val="27"/>
         </w:rPr>
         <w:tab/>
         <w:t xml:space="preserve">Анализ </w:t>
       </w:r>
       <w:r>
         <w:rPr>
-          <w:szCs w:val="28"/>
+          <w:sz w:val="27"/>
+          <w:szCs w:val="27"/>
         </w:rPr>
         <w:t xml:space="preserve">существующих процедур </w:t>
       </w:r>
       <w:r>
         <w:rPr>
           <w:rFonts w:cs="Times New Roman"/>
-          <w:szCs w:val="28"/>
-        </w:rPr>
-        <w:t>и</w:t>
+          <w:sz w:val="27"/>
+          <w:szCs w:val="27"/>
+        </w:rPr>
+        <w:t>тестирования</w:t>
       </w:r>
       <w:r>
         <w:rPr>
           <w:rFonts w:cs="Times New Roman"/>
-          <w:szCs w:val="28"/>
-        </w:rPr>
-        <w:t>дентифи</w:t>
-      </w:r>
-      <w:r>
-        <w:rPr>
-          <w:rFonts w:cs="Times New Roman"/>
-          <w:szCs w:val="28"/>
-        </w:rPr>
-        <w:t xml:space="preserve">кации </w:t>
-      </w:r>
-      <w:r>
-        <w:rPr>
-          <w:szCs w:val="28"/>
+          <w:sz w:val="27"/>
+          <w:szCs w:val="27"/>
+        </w:rPr>
+        <w:t xml:space="preserve"> </w:t>
+      </w:r>
+      <w:r>
+        <w:rPr>
+          <w:sz w:val="27"/>
+          <w:szCs w:val="27"/>
         </w:rPr>
         <w:t>компонентов.</w:t>
       </w:r>
@@ -1249,38 +1198,52 @@
       <w:pPr>
         <w:jc w:val="both"/>
         <w:rPr>
-          <w:szCs w:val="28"/>
-        </w:rPr>
-      </w:pPr>
-      <w:r>
-        <w:rPr>
-          <w:szCs w:val="28"/>
+          <w:sz w:val="27"/>
+          <w:szCs w:val="27"/>
+        </w:rPr>
+      </w:pPr>
+      <w:r>
+        <w:rPr>
+          <w:sz w:val="27"/>
+          <w:szCs w:val="27"/>
         </w:rPr>
         <w:t>2.</w:t>
       </w:r>
       <w:r>
         <w:rPr>
-          <w:szCs w:val="28"/>
+          <w:sz w:val="27"/>
+          <w:szCs w:val="27"/>
         </w:rPr>
         <w:tab/>
         <w:t xml:space="preserve">Теоретическое исследование </w:t>
       </w:r>
       <w:r>
         <w:rPr>
-          <w:szCs w:val="28"/>
+          <w:sz w:val="27"/>
+          <w:szCs w:val="27"/>
         </w:rPr>
         <w:t xml:space="preserve">процедур </w:t>
       </w:r>
       <w:r>
         <w:rPr>
           <w:rFonts w:cs="Times New Roman"/>
-          <w:szCs w:val="28"/>
-        </w:rPr>
-        <w:t xml:space="preserve">идентификации </w:t>
-      </w:r>
-      <w:r>
-        <w:rPr>
-          <w:szCs w:val="28"/>
+          <w:sz w:val="27"/>
+          <w:szCs w:val="27"/>
+        </w:rPr>
+        <w:t>тестирования</w:t>
+      </w:r>
+      <w:r>
+        <w:rPr>
+          <w:rFonts w:cs="Times New Roman"/>
+          <w:sz w:val="27"/>
+          <w:szCs w:val="27"/>
+        </w:rPr>
+        <w:t xml:space="preserve"> </w:t>
+      </w:r>
+      <w:r>
+        <w:rPr>
+          <w:sz w:val="27"/>
+          <w:szCs w:val="27"/>
         </w:rPr>
         <w:t>компонентов.</w:t>
       </w:r>
@@ -1289,126 +1252,204 @@
       <w:pPr>
         <w:jc w:val="both"/>
         <w:rPr>
-          <w:szCs w:val="28"/>
-        </w:rPr>
-      </w:pPr>
-      <w:r>
-        <w:rPr>
-          <w:szCs w:val="28"/>
+          <w:sz w:val="27"/>
+          <w:szCs w:val="27"/>
+        </w:rPr>
+      </w:pPr>
+      <w:r>
+        <w:rPr>
+          <w:sz w:val="27"/>
+          <w:szCs w:val="27"/>
         </w:rPr>
         <w:t>3.</w:t>
       </w:r>
       <w:r>
         <w:rPr>
-          <w:szCs w:val="28"/>
+          <w:sz w:val="27"/>
+          <w:szCs w:val="27"/>
         </w:rPr>
         <w:tab/>
         <w:t xml:space="preserve">Разработка </w:t>
       </w:r>
       <w:r>
         <w:rPr>
-          <w:szCs w:val="28"/>
-        </w:rPr>
-        <w:t>устройства «Тестер компонентов».</w:t>
+          <w:sz w:val="27"/>
+          <w:szCs w:val="27"/>
+        </w:rPr>
+        <w:t>устройства «</w:t>
+      </w:r>
+      <w:r>
+        <w:rPr>
+          <w:sz w:val="27"/>
+          <w:szCs w:val="27"/>
+        </w:rPr>
+        <w:t>Тестер компонентов на базе микроконтроллера STM32</w:t>
+      </w:r>
+      <w:r>
+        <w:rPr>
+          <w:sz w:val="27"/>
+          <w:szCs w:val="27"/>
+        </w:rPr>
+        <w:t>».</w:t>
       </w:r>
     </w:p>
     <w:p>
       <w:pPr>
         <w:jc w:val="both"/>
         <w:rPr>
-          <w:szCs w:val="28"/>
-        </w:rPr>
-      </w:pPr>
-      <w:r>
-        <w:rPr>
-          <w:szCs w:val="28"/>
+          <w:sz w:val="27"/>
+          <w:szCs w:val="27"/>
+        </w:rPr>
+      </w:pPr>
+      <w:r>
+        <w:rPr>
+          <w:sz w:val="27"/>
+          <w:szCs w:val="27"/>
         </w:rPr>
         <w:t>4.</w:t>
       </w:r>
       <w:r>
         <w:rPr>
-          <w:szCs w:val="28"/>
+          <w:sz w:val="27"/>
+          <w:szCs w:val="27"/>
         </w:rPr>
         <w:tab/>
         <w:t xml:space="preserve">Проектирование </w:t>
       </w:r>
       <w:r>
         <w:rPr>
-          <w:szCs w:val="28"/>
-        </w:rPr>
-        <w:t>устройства «Тестер компонентов».</w:t>
+          <w:sz w:val="27"/>
+          <w:szCs w:val="27"/>
+        </w:rPr>
+        <w:t>устройства «</w:t>
+      </w:r>
+      <w:r>
+        <w:rPr>
+          <w:sz w:val="27"/>
+          <w:szCs w:val="27"/>
+        </w:rPr>
+        <w:t>Тестер компонентов на базе микроконтроллера STM32</w:t>
+      </w:r>
+      <w:r>
+        <w:rPr>
+          <w:sz w:val="27"/>
+          <w:szCs w:val="27"/>
+        </w:rPr>
+        <w:t>».</w:t>
       </w:r>
     </w:p>
     <w:p>
       <w:pPr>
         <w:jc w:val="both"/>
         <w:rPr>
-          <w:szCs w:val="28"/>
-        </w:rPr>
-      </w:pPr>
-      <w:r>
-        <w:rPr>
-          <w:szCs w:val="28"/>
+          <w:sz w:val="27"/>
+          <w:szCs w:val="27"/>
+        </w:rPr>
+      </w:pPr>
+      <w:r>
+        <w:rPr>
+          <w:sz w:val="27"/>
+          <w:szCs w:val="27"/>
         </w:rPr>
         <w:t>5.</w:t>
       </w:r>
       <w:r>
         <w:rPr>
-          <w:szCs w:val="28"/>
+          <w:sz w:val="27"/>
+          <w:szCs w:val="27"/>
         </w:rPr>
         <w:tab/>
         <w:t xml:space="preserve">Отладка </w:t>
       </w:r>
       <w:r>
         <w:rPr>
-          <w:szCs w:val="28"/>
-        </w:rPr>
-        <w:t>устройства «Тестер компонентов».</w:t>
+          <w:sz w:val="27"/>
+          <w:szCs w:val="27"/>
+        </w:rPr>
+        <w:t>устройства «</w:t>
+      </w:r>
+      <w:r>
+        <w:rPr>
+          <w:sz w:val="27"/>
+          <w:szCs w:val="27"/>
+        </w:rPr>
+        <w:t>Тестер компонентов на базе микроконтроллера STM32</w:t>
+      </w:r>
+      <w:r>
+        <w:rPr>
+          <w:sz w:val="27"/>
+          <w:szCs w:val="27"/>
+        </w:rPr>
+        <w:t>».</w:t>
       </w:r>
     </w:p>
     <w:p>
       <w:pPr>
         <w:jc w:val="both"/>
         <w:rPr>
-          <w:szCs w:val="28"/>
-        </w:rPr>
-      </w:pPr>
-      <w:r>
-        <w:rPr>
-          <w:szCs w:val="28"/>
+          <w:sz w:val="27"/>
+          <w:szCs w:val="27"/>
+        </w:rPr>
+      </w:pPr>
+      <w:r>
+        <w:rPr>
+          <w:sz w:val="27"/>
+          <w:szCs w:val="27"/>
         </w:rPr>
         <w:t>6.</w:t>
       </w:r>
       <w:r>
         <w:rPr>
-          <w:szCs w:val="28"/>
+          <w:sz w:val="27"/>
+          <w:szCs w:val="27"/>
         </w:rPr>
         <w:tab/>
         <w:t>Экспериментальное исследование</w:t>
       </w:r>
       <w:r>
         <w:rPr>
-          <w:szCs w:val="28"/>
-        </w:rPr>
-        <w:t xml:space="preserve"> устройства «Тестер компонентов».</w:t>
+          <w:sz w:val="27"/>
+          <w:szCs w:val="27"/>
+        </w:rPr>
+        <w:t xml:space="preserve"> устройства «</w:t>
+      </w:r>
+      <w:r>
+        <w:rPr>
+          <w:sz w:val="27"/>
+          <w:szCs w:val="27"/>
+        </w:rPr>
+        <w:t>Тестер компонентов на базе микроконтроллера STM32</w:t>
+      </w:r>
+      <w:r>
+        <w:rPr>
+          <w:sz w:val="27"/>
+          <w:szCs w:val="27"/>
+        </w:rPr>
+        <w:t>».</w:t>
       </w:r>
     </w:p>
     <w:p>
       <w:pPr>
         <w:jc w:val="both"/>
         <w:rPr>
-          <w:szCs w:val="28"/>
-        </w:rPr>
-      </w:pPr>
-      <w:r>
-        <w:rPr>
-          <w:szCs w:val="28"/>
+          <w:rFonts w:eastAsia="Times New Roman" w:cs="Times New Roman"/>
+          <w:b/>
+          <w:sz w:val="27"/>
+          <w:szCs w:val="27"/>
+          <w:lang w:eastAsia="ru-RU"/>
+        </w:rPr>
+      </w:pPr>
+      <w:r>
+        <w:rPr>
+          <w:sz w:val="27"/>
+          <w:szCs w:val="27"/>
         </w:rPr>
         <w:t>7.</w:t>
       </w:r>
       <w:r>
         <w:rPr>
-          <w:szCs w:val="28"/>
+          <w:sz w:val="27"/>
+          <w:szCs w:val="27"/>
         </w:rPr>
         <w:tab/>
         <w:t>Разработка технического задания (ТЗ) на квалификационную работу бакалавра.</w:t>
@@ -1416,27 +1457,8 @@
     </w:p>
     <w:p>
       <w:pPr>
-        <w:spacing w:line="240" w:lineRule="auto"/>
-        <w:ind w:firstLine="0"/>
-        <w:rPr>
-          <w:rFonts w:eastAsia="Times New Roman" w:cs="Times New Roman"/>
-          <w:b/>
-          <w:szCs w:val="28"/>
-          <w:lang w:eastAsia="ru-RU"/>
-        </w:rPr>
-      </w:pPr>
-      <w:r>
-        <w:rPr>
-          <w:b/>
-          <w:szCs w:val="28"/>
-        </w:rPr>
-        <w:br w:type="page"/>
-      </w:r>
-    </w:p>
-    <w:p>
-      <w:pPr>
         <w:pStyle w:val="21"/>
-        <w:spacing w:before="120" w:after="120" w:line="276" w:lineRule="auto"/>
+        <w:spacing w:before="120" w:after="120" w:line="360" w:lineRule="auto"/>
         <w:ind w:left="0" w:firstLine="709"/>
         <w:jc w:val="both"/>
         <w:rPr>
@@ -1451,7 +1473,6 @@
           <w:sz w:val="28"/>
           <w:szCs w:val="28"/>
         </w:rPr>
-        <w:lastRenderedPageBreak/>
         <w:t xml:space="preserve">3 </w:t>
       </w:r>
       <w:r>
@@ -1467,26 +1488,31 @@
       <w:pPr>
         <w:jc w:val="both"/>
         <w:rPr>
-          <w:szCs w:val="28"/>
-        </w:rPr>
-      </w:pPr>
-      <w:r>
-        <w:rPr>
-          <w:szCs w:val="28"/>
-        </w:rPr>
+          <w:sz w:val="27"/>
+          <w:szCs w:val="27"/>
+        </w:rPr>
+      </w:pPr>
+      <w:r>
+        <w:rPr>
+          <w:sz w:val="27"/>
+          <w:szCs w:val="27"/>
+        </w:rPr>
+        <w:lastRenderedPageBreak/>
         <w:t xml:space="preserve">3.1 </w:t>
       </w:r>
       <w:r>
         <w:rPr>
-          <w:szCs w:val="28"/>
+          <w:sz w:val="27"/>
+          <w:szCs w:val="27"/>
         </w:rPr>
         <w:t>Основные требования</w:t>
       </w:r>
       <w:r>
         <w:rPr>
-          <w:szCs w:val="28"/>
-        </w:rPr>
-        <w:t>.</w:t>
+          <w:sz w:val="27"/>
+          <w:szCs w:val="27"/>
+        </w:rPr>
+        <w:t>:</w:t>
       </w:r>
     </w:p>
     <w:p>
@@ -1494,25 +1520,22 @@
         <w:jc w:val="both"/>
         <w:rPr>
           <w:rFonts w:cs="Times New Roman"/>
-          <w:szCs w:val="28"/>
-        </w:rPr>
-      </w:pPr>
-      <w:r>
-        <w:rPr>
-          <w:szCs w:val="28"/>
-        </w:rPr>
-        <w:t xml:space="preserve">3.1.1 </w:t>
-      </w:r>
-      <w:r>
-        <w:rPr>
-          <w:szCs w:val="28"/>
-        </w:rPr>
-        <w:t xml:space="preserve">В ходе выполнения курсовой работы должны быть проведены </w:t>
+          <w:sz w:val="27"/>
+          <w:szCs w:val="27"/>
+        </w:rPr>
+      </w:pPr>
+      <w:r>
+        <w:rPr>
+          <w:sz w:val="27"/>
+          <w:szCs w:val="27"/>
+        </w:rPr>
+        <w:t xml:space="preserve">3.1.1 В ходе выполнения курсовой работы должны быть проведены </w:t>
       </w:r>
       <w:r>
         <w:rPr>
           <w:rFonts w:cs="Times New Roman"/>
-          <w:szCs w:val="28"/>
+          <w:sz w:val="27"/>
+          <w:szCs w:val="27"/>
         </w:rPr>
         <w:t>теоретические и экспериментальные исследования с целью решения задач, указанных в п. 2. настоящего ТЗ.</w:t>
       </w:r>
@@ -1522,32 +1545,44 @@
         <w:jc w:val="both"/>
         <w:rPr>
           <w:rFonts w:cs="Times New Roman"/>
-          <w:szCs w:val="28"/>
+          <w:sz w:val="27"/>
+          <w:szCs w:val="27"/>
         </w:rPr>
       </w:pPr>
       <w:r>
         <w:rPr>
           <w:rFonts w:cs="Times New Roman"/>
-          <w:szCs w:val="28"/>
+          <w:sz w:val="27"/>
+          <w:szCs w:val="27"/>
         </w:rPr>
         <w:t>3.1.2 Разработанное в ходе работы устройство «</w:t>
       </w:r>
       <w:r>
         <w:rPr>
-          <w:szCs w:val="28"/>
-        </w:rPr>
-        <w:t>Т</w:t>
-      </w:r>
-      <w:r>
-        <w:rPr>
-          <w:szCs w:val="28"/>
-        </w:rPr>
-        <w:t>естер компонентов</w:t>
+          <w:sz w:val="27"/>
+          <w:szCs w:val="27"/>
+        </w:rPr>
+        <w:t>Тест</w:t>
+      </w:r>
+      <w:r>
+        <w:rPr>
+          <w:sz w:val="27"/>
+          <w:szCs w:val="27"/>
+        </w:rPr>
+        <w:t>е</w:t>
+      </w:r>
+      <w:r>
+        <w:rPr>
+          <w:sz w:val="27"/>
+          <w:szCs w:val="27"/>
+        </w:rPr>
+        <w:t>р компонентов на базе микроконтроллера STM32</w:t>
       </w:r>
       <w:r>
         <w:rPr>
           <w:rFonts w:cs="Times New Roman"/>
-          <w:szCs w:val="28"/>
+          <w:sz w:val="27"/>
+          <w:szCs w:val="27"/>
         </w:rPr>
         <w:t>» должно соответствовать следующим требования:</w:t>
       </w:r>
@@ -1564,31 +1599,31 @@
         <w:jc w:val="both"/>
         <w:rPr>
           <w:rFonts w:ascii="Times New Roman" w:hAnsi="Times New Roman" w:cs="Times New Roman"/>
-          <w:sz w:val="28"/>
-          <w:szCs w:val="28"/>
-        </w:rPr>
-      </w:pPr>
-      <w:r>
-        <w:rPr>
-          <w:rFonts w:ascii="Times New Roman" w:hAnsi="Times New Roman" w:cs="Times New Roman"/>
-          <w:sz w:val="28"/>
-          <w:szCs w:val="28"/>
+          <w:sz w:val="27"/>
+          <w:szCs w:val="27"/>
+        </w:rPr>
+      </w:pPr>
+      <w:r>
+        <w:rPr>
+          <w:rFonts w:ascii="Times New Roman" w:hAnsi="Times New Roman" w:cs="Times New Roman"/>
+          <w:sz w:val="27"/>
+          <w:szCs w:val="27"/>
         </w:rPr>
         <w:t xml:space="preserve">Входное напряжение: </w:t>
       </w:r>
       <w:r>
         <w:rPr>
           <w:rFonts w:ascii="Times New Roman" w:hAnsi="Times New Roman" w:cs="Times New Roman"/>
-          <w:sz w:val="28"/>
-          <w:szCs w:val="28"/>
+          <w:sz w:val="27"/>
+          <w:szCs w:val="27"/>
         </w:rPr>
         <w:t>5</w:t>
       </w:r>
       <w:r>
         <w:rPr>
           <w:rFonts w:ascii="Times New Roman" w:hAnsi="Times New Roman" w:cs="Times New Roman"/>
-          <w:sz w:val="28"/>
-          <w:szCs w:val="28"/>
+          <w:sz w:val="27"/>
+          <w:szCs w:val="27"/>
         </w:rPr>
         <w:t>В (постоянное).</w:t>
       </w:r>
@@ -1605,23 +1640,31 @@
         <w:jc w:val="both"/>
         <w:rPr>
           <w:rFonts w:ascii="Times New Roman" w:hAnsi="Times New Roman" w:cs="Times New Roman"/>
-          <w:sz w:val="28"/>
-          <w:szCs w:val="28"/>
-        </w:rPr>
-      </w:pPr>
-      <w:r>
-        <w:rPr>
-          <w:rFonts w:ascii="Times New Roman" w:hAnsi="Times New Roman" w:cs="Times New Roman"/>
-          <w:sz w:val="28"/>
-          <w:szCs w:val="28"/>
-        </w:rPr>
-        <w:t>Идентифицировать компоненты</w:t>
-      </w:r>
-      <w:r>
-        <w:rPr>
-          <w:rFonts w:ascii="Times New Roman" w:hAnsi="Times New Roman" w:cs="Times New Roman"/>
-          <w:sz w:val="28"/>
-          <w:szCs w:val="28"/>
+          <w:sz w:val="27"/>
+          <w:szCs w:val="27"/>
+        </w:rPr>
+      </w:pPr>
+      <w:r>
+        <w:rPr>
+          <w:rFonts w:ascii="Times New Roman" w:hAnsi="Times New Roman" w:cs="Times New Roman"/>
+          <w:sz w:val="27"/>
+          <w:szCs w:val="27"/>
+        </w:rPr>
+        <w:t>Тестировать</w:t>
+      </w:r>
+      <w:r>
+        <w:rPr>
+          <w:rFonts w:ascii="Times New Roman" w:hAnsi="Times New Roman" w:cs="Times New Roman"/>
+          <w:sz w:val="27"/>
+          <w:szCs w:val="27"/>
+        </w:rPr>
+        <w:t xml:space="preserve"> компоненты</w:t>
+      </w:r>
+      <w:r>
+        <w:rPr>
+          <w:rFonts w:ascii="Times New Roman" w:hAnsi="Times New Roman" w:cs="Times New Roman"/>
+          <w:sz w:val="27"/>
+          <w:szCs w:val="27"/>
         </w:rPr>
         <w:t>:</w:t>
       </w:r>
@@ -1637,23 +1680,23 @@
         <w:jc w:val="both"/>
         <w:rPr>
           <w:rFonts w:ascii="Times New Roman" w:hAnsi="Times New Roman" w:cs="Times New Roman"/>
-          <w:sz w:val="28"/>
-          <w:szCs w:val="28"/>
-        </w:rPr>
-      </w:pPr>
-      <w:r>
-        <w:rPr>
-          <w:rFonts w:ascii="Times New Roman" w:hAnsi="Times New Roman" w:cs="Times New Roman"/>
-          <w:sz w:val="28"/>
-          <w:szCs w:val="28"/>
+          <w:sz w:val="27"/>
+          <w:szCs w:val="27"/>
+        </w:rPr>
+      </w:pPr>
+      <w:r>
+        <w:rPr>
+          <w:rFonts w:ascii="Times New Roman" w:hAnsi="Times New Roman" w:cs="Times New Roman"/>
+          <w:sz w:val="27"/>
+          <w:szCs w:val="27"/>
         </w:rPr>
         <w:t>Резистор</w:t>
       </w:r>
       <w:r>
         <w:rPr>
           <w:rFonts w:ascii="Times New Roman" w:hAnsi="Times New Roman" w:cs="Times New Roman"/>
-          <w:sz w:val="28"/>
-          <w:szCs w:val="28"/>
+          <w:sz w:val="27"/>
+          <w:szCs w:val="27"/>
         </w:rPr>
         <w:t>ы</w:t>
       </w:r>
@@ -1669,23 +1712,23 @@
         <w:jc w:val="both"/>
         <w:rPr>
           <w:rFonts w:ascii="Times New Roman" w:hAnsi="Times New Roman" w:cs="Times New Roman"/>
-          <w:sz w:val="28"/>
-          <w:szCs w:val="28"/>
-        </w:rPr>
-      </w:pPr>
-      <w:r>
-        <w:rPr>
-          <w:rFonts w:ascii="Times New Roman" w:hAnsi="Times New Roman" w:cs="Times New Roman"/>
-          <w:sz w:val="28"/>
-          <w:szCs w:val="28"/>
+          <w:sz w:val="27"/>
+          <w:szCs w:val="27"/>
+        </w:rPr>
+      </w:pPr>
+      <w:r>
+        <w:rPr>
+          <w:rFonts w:ascii="Times New Roman" w:hAnsi="Times New Roman" w:cs="Times New Roman"/>
+          <w:sz w:val="27"/>
+          <w:szCs w:val="27"/>
         </w:rPr>
         <w:t>Конденсатор</w:t>
       </w:r>
       <w:r>
         <w:rPr>
           <w:rFonts w:ascii="Times New Roman" w:hAnsi="Times New Roman" w:cs="Times New Roman"/>
-          <w:sz w:val="28"/>
-          <w:szCs w:val="28"/>
+          <w:sz w:val="27"/>
+          <w:szCs w:val="27"/>
         </w:rPr>
         <w:t>ы</w:t>
       </w:r>
@@ -1701,15 +1744,15 @@
         <w:jc w:val="both"/>
         <w:rPr>
           <w:rFonts w:ascii="Times New Roman" w:hAnsi="Times New Roman" w:cs="Times New Roman"/>
-          <w:sz w:val="28"/>
-          <w:szCs w:val="28"/>
-        </w:rPr>
-      </w:pPr>
-      <w:r>
-        <w:rPr>
-          <w:rFonts w:ascii="Times New Roman" w:hAnsi="Times New Roman" w:cs="Times New Roman"/>
-          <w:sz w:val="28"/>
-          <w:szCs w:val="28"/>
+          <w:sz w:val="27"/>
+          <w:szCs w:val="27"/>
+        </w:rPr>
+      </w:pPr>
+      <w:r>
+        <w:rPr>
+          <w:rFonts w:ascii="Times New Roman" w:hAnsi="Times New Roman" w:cs="Times New Roman"/>
+          <w:sz w:val="27"/>
+          <w:szCs w:val="27"/>
           <w:lang w:val="en-US"/>
         </w:rPr>
         <w:t>NPN</w:t>
@@ -1717,32 +1760,16 @@
       <w:r>
         <w:rPr>
           <w:rFonts w:ascii="Times New Roman" w:hAnsi="Times New Roman" w:cs="Times New Roman"/>
-          <w:sz w:val="28"/>
-          <w:szCs w:val="28"/>
-        </w:rPr>
-        <w:t xml:space="preserve"> </w:t>
-      </w:r>
-      <w:r>
-        <w:rPr>
-          <w:rFonts w:ascii="Times New Roman" w:hAnsi="Times New Roman" w:cs="Times New Roman"/>
-          <w:sz w:val="28"/>
-          <w:szCs w:val="28"/>
-        </w:rPr>
-        <w:t>и</w:t>
-      </w:r>
-      <w:r>
-        <w:rPr>
-          <w:rFonts w:ascii="Times New Roman" w:hAnsi="Times New Roman" w:cs="Times New Roman"/>
-          <w:sz w:val="28"/>
-          <w:szCs w:val="28"/>
-        </w:rPr>
-        <w:t xml:space="preserve"> </w:t>
-      </w:r>
-      <w:r>
-        <w:rPr>
-          <w:rFonts w:ascii="Times New Roman" w:hAnsi="Times New Roman" w:cs="Times New Roman"/>
-          <w:sz w:val="28"/>
-          <w:szCs w:val="28"/>
+          <w:sz w:val="27"/>
+          <w:szCs w:val="27"/>
+        </w:rPr>
+        <w:t xml:space="preserve"> и </w:t>
+      </w:r>
+      <w:r>
+        <w:rPr>
+          <w:rFonts w:ascii="Times New Roman" w:hAnsi="Times New Roman" w:cs="Times New Roman"/>
+          <w:sz w:val="27"/>
+          <w:szCs w:val="27"/>
           <w:lang w:val="en-US"/>
         </w:rPr>
         <w:t>PNP</w:t>
@@ -1750,166 +1777,34 @@
       <w:r>
         <w:rPr>
           <w:rFonts w:ascii="Times New Roman" w:hAnsi="Times New Roman" w:cs="Times New Roman"/>
-          <w:sz w:val="28"/>
-          <w:szCs w:val="28"/>
-        </w:rPr>
-        <w:t xml:space="preserve"> </w:t>
-      </w:r>
-      <w:r>
-        <w:rPr>
-          <w:rFonts w:ascii="Times New Roman" w:hAnsi="Times New Roman" w:cs="Times New Roman"/>
-          <w:sz w:val="28"/>
-          <w:szCs w:val="28"/>
-        </w:rPr>
-        <w:t>биполярны</w:t>
-      </w:r>
-      <w:r>
-        <w:rPr>
-          <w:rFonts w:ascii="Times New Roman" w:hAnsi="Times New Roman" w:cs="Times New Roman"/>
-          <w:sz w:val="28"/>
-          <w:szCs w:val="28"/>
+          <w:sz w:val="27"/>
+          <w:szCs w:val="27"/>
+        </w:rPr>
+        <w:t xml:space="preserve"> биполярны</w:t>
+      </w:r>
+      <w:r>
+        <w:rPr>
+          <w:rFonts w:ascii="Times New Roman" w:hAnsi="Times New Roman" w:cs="Times New Roman"/>
+          <w:sz w:val="27"/>
+          <w:szCs w:val="27"/>
         </w:rPr>
         <w:t>е</w:t>
       </w:r>
       <w:r>
         <w:rPr>
           <w:rFonts w:ascii="Times New Roman" w:hAnsi="Times New Roman" w:cs="Times New Roman"/>
-          <w:sz w:val="28"/>
-          <w:szCs w:val="28"/>
-        </w:rPr>
-        <w:t xml:space="preserve"> </w:t>
-      </w:r>
-      <w:r>
-        <w:rPr>
-          <w:rFonts w:ascii="Times New Roman" w:hAnsi="Times New Roman" w:cs="Times New Roman"/>
-          <w:sz w:val="28"/>
-          <w:szCs w:val="28"/>
-        </w:rPr>
-        <w:t>транзистор</w:t>
-      </w:r>
-      <w:r>
-        <w:rPr>
-          <w:rFonts w:ascii="Times New Roman" w:hAnsi="Times New Roman" w:cs="Times New Roman"/>
-          <w:sz w:val="28"/>
-          <w:szCs w:val="28"/>
+          <w:sz w:val="27"/>
+          <w:szCs w:val="27"/>
+        </w:rPr>
+        <w:t xml:space="preserve"> транзистор</w:t>
+      </w:r>
+      <w:r>
+        <w:rPr>
+          <w:rFonts w:ascii="Times New Roman" w:hAnsi="Times New Roman" w:cs="Times New Roman"/>
+          <w:sz w:val="27"/>
+          <w:szCs w:val="27"/>
         </w:rPr>
         <w:t>ы</w:t>
-      </w:r>
-    </w:p>
-    <w:p>
-      <w:pPr>
-        <w:pStyle w:val="a4"/>
-        <w:numPr>
-          <w:ilvl w:val="1"/>
-          <w:numId w:val="41"/>
-        </w:numPr>
-        <w:spacing w:line="360" w:lineRule="auto"/>
-        <w:jc w:val="both"/>
-        <w:rPr>
-          <w:rFonts w:ascii="Times New Roman" w:hAnsi="Times New Roman" w:cs="Times New Roman"/>
-          <w:sz w:val="28"/>
-          <w:szCs w:val="28"/>
-        </w:rPr>
-      </w:pPr>
-      <w:r>
-        <w:rPr>
-          <w:rFonts w:ascii="Times New Roman" w:hAnsi="Times New Roman" w:cs="Times New Roman"/>
-          <w:sz w:val="28"/>
-          <w:szCs w:val="28"/>
-          <w:lang w:val="en-US"/>
-        </w:rPr>
-        <w:t>N</w:t>
-      </w:r>
-      <w:r>
-        <w:rPr>
-          <w:rFonts w:ascii="Times New Roman" w:hAnsi="Times New Roman" w:cs="Times New Roman"/>
-          <w:sz w:val="28"/>
-          <w:szCs w:val="28"/>
-        </w:rPr>
-        <w:t xml:space="preserve"> </w:t>
-      </w:r>
-      <w:r>
-        <w:rPr>
-          <w:rFonts w:ascii="Times New Roman" w:hAnsi="Times New Roman" w:cs="Times New Roman"/>
-          <w:sz w:val="28"/>
-          <w:szCs w:val="28"/>
-        </w:rPr>
-        <w:t>и</w:t>
-      </w:r>
-      <w:r>
-        <w:rPr>
-          <w:rFonts w:ascii="Times New Roman" w:hAnsi="Times New Roman" w:cs="Times New Roman"/>
-          <w:sz w:val="28"/>
-          <w:szCs w:val="28"/>
-        </w:rPr>
-        <w:t xml:space="preserve"> </w:t>
-      </w:r>
-      <w:r>
-        <w:rPr>
-          <w:rFonts w:ascii="Times New Roman" w:hAnsi="Times New Roman" w:cs="Times New Roman"/>
-          <w:sz w:val="28"/>
-          <w:szCs w:val="28"/>
-          <w:lang w:val="en-US"/>
-        </w:rPr>
-        <w:t>P</w:t>
-      </w:r>
-      <w:r>
-        <w:rPr>
-          <w:rFonts w:ascii="Times New Roman" w:hAnsi="Times New Roman" w:cs="Times New Roman"/>
-          <w:sz w:val="28"/>
-          <w:szCs w:val="28"/>
-        </w:rPr>
-        <w:t xml:space="preserve"> </w:t>
-      </w:r>
-      <w:r>
-        <w:rPr>
-          <w:rFonts w:ascii="Times New Roman" w:hAnsi="Times New Roman" w:cs="Times New Roman"/>
-          <w:sz w:val="28"/>
-          <w:szCs w:val="28"/>
-        </w:rPr>
-        <w:t>канальный</w:t>
-      </w:r>
-      <w:r>
-        <w:rPr>
-          <w:rFonts w:ascii="Times New Roman" w:hAnsi="Times New Roman" w:cs="Times New Roman"/>
-          <w:sz w:val="28"/>
-          <w:szCs w:val="28"/>
-        </w:rPr>
-        <w:t xml:space="preserve"> </w:t>
-      </w:r>
-      <w:r>
-        <w:rPr>
-          <w:rFonts w:ascii="Times New Roman" w:hAnsi="Times New Roman" w:cs="Times New Roman"/>
-          <w:sz w:val="28"/>
-          <w:szCs w:val="28"/>
-          <w:lang w:val="en-US"/>
-        </w:rPr>
-        <w:t>M</w:t>
-      </w:r>
-      <w:r>
-        <w:rPr>
-          <w:rFonts w:ascii="Times New Roman" w:hAnsi="Times New Roman" w:cs="Times New Roman"/>
-          <w:sz w:val="28"/>
-          <w:szCs w:val="28"/>
-          <w:lang w:val="en-US"/>
-        </w:rPr>
-        <w:t>OSFET</w:t>
-      </w:r>
-      <w:r>
-        <w:rPr>
-          <w:rFonts w:ascii="Times New Roman" w:hAnsi="Times New Roman" w:cs="Times New Roman"/>
-          <w:sz w:val="28"/>
-          <w:szCs w:val="28"/>
-        </w:rPr>
-        <w:t xml:space="preserve"> транзисторы</w:t>
-      </w:r>
-      <w:r>
-        <w:rPr>
-          <w:rFonts w:ascii="Times New Roman" w:hAnsi="Times New Roman" w:cs="Times New Roman"/>
-          <w:sz w:val="28"/>
-          <w:szCs w:val="28"/>
-        </w:rPr>
-        <w:t>.</w:t>
       </w:r>
     </w:p>
     <w:p>
@@ -1923,24 +1818,24 @@
         <w:jc w:val="both"/>
         <w:rPr>
           <w:rFonts w:ascii="Times New Roman" w:hAnsi="Times New Roman" w:cs="Times New Roman"/>
-          <w:sz w:val="28"/>
-          <w:szCs w:val="28"/>
+          <w:sz w:val="27"/>
+          <w:szCs w:val="27"/>
           <w:lang w:val="en-US"/>
         </w:rPr>
       </w:pPr>
       <w:r>
         <w:rPr>
           <w:rFonts w:ascii="Times New Roman" w:hAnsi="Times New Roman" w:cs="Times New Roman"/>
-          <w:sz w:val="28"/>
-          <w:szCs w:val="28"/>
+          <w:sz w:val="27"/>
+          <w:szCs w:val="27"/>
         </w:rPr>
         <w:t>Рабочий</w:t>
       </w:r>
       <w:r>
         <w:rPr>
           <w:rFonts w:ascii="Times New Roman" w:hAnsi="Times New Roman" w:cs="Times New Roman"/>
-          <w:sz w:val="28"/>
-          <w:szCs w:val="28"/>
+          <w:sz w:val="27"/>
+          <w:szCs w:val="27"/>
           <w:lang w:val="en-US"/>
         </w:rPr>
         <w:t xml:space="preserve"> </w:t>
@@ -1948,16 +1843,16 @@
       <w:r>
         <w:rPr>
           <w:rFonts w:ascii="Times New Roman" w:hAnsi="Times New Roman" w:cs="Times New Roman"/>
-          <w:sz w:val="28"/>
-          <w:szCs w:val="28"/>
+          <w:sz w:val="27"/>
+          <w:szCs w:val="27"/>
         </w:rPr>
         <w:t>температурный</w:t>
       </w:r>
       <w:r>
         <w:rPr>
           <w:rFonts w:ascii="Times New Roman" w:hAnsi="Times New Roman" w:cs="Times New Roman"/>
-          <w:sz w:val="28"/>
-          <w:szCs w:val="28"/>
+          <w:sz w:val="27"/>
+          <w:szCs w:val="27"/>
           <w:lang w:val="en-US"/>
         </w:rPr>
         <w:t xml:space="preserve"> </w:t>
@@ -1965,16 +1860,16 @@
       <w:r>
         <w:rPr>
           <w:rFonts w:ascii="Times New Roman" w:hAnsi="Times New Roman" w:cs="Times New Roman"/>
-          <w:sz w:val="28"/>
-          <w:szCs w:val="28"/>
+          <w:sz w:val="27"/>
+          <w:szCs w:val="27"/>
         </w:rPr>
         <w:t>диапазон</w:t>
       </w:r>
       <w:r>
         <w:rPr>
           <w:rFonts w:ascii="Times New Roman" w:hAnsi="Times New Roman" w:cs="Times New Roman"/>
-          <w:sz w:val="28"/>
-          <w:szCs w:val="28"/>
+          <w:sz w:val="27"/>
+          <w:szCs w:val="27"/>
           <w:lang w:val="en-US"/>
         </w:rPr>
         <w:t xml:space="preserve">: </w:t>
@@ -1982,8 +1877,8 @@
       <w:r>
         <w:rPr>
           <w:rFonts w:ascii="Times New Roman" w:hAnsi="Times New Roman" w:cs="Times New Roman"/>
-          <w:sz w:val="28"/>
-          <w:szCs w:val="28"/>
+          <w:sz w:val="27"/>
+          <w:szCs w:val="27"/>
           <w:lang w:val="en-US"/>
         </w:rPr>
         <w:t>0</w:t>
@@ -1991,8 +1886,8 @@
       <w:r>
         <w:rPr>
           <w:rFonts w:ascii="Times New Roman" w:hAnsi="Times New Roman" w:cs="Times New Roman"/>
-          <w:sz w:val="28"/>
-          <w:szCs w:val="28"/>
+          <w:sz w:val="27"/>
+          <w:szCs w:val="27"/>
           <w:lang w:val="en-US"/>
         </w:rPr>
         <w:t>…+</w:t>
@@ -2000,8 +1895,8 @@
       <w:r>
         <w:rPr>
           <w:rFonts w:ascii="Times New Roman" w:hAnsi="Times New Roman" w:cs="Times New Roman"/>
-          <w:sz w:val="28"/>
-          <w:szCs w:val="28"/>
+          <w:sz w:val="27"/>
+          <w:szCs w:val="27"/>
           <w:lang w:val="en-US"/>
         </w:rPr>
         <w:t>35</w:t>
@@ -2009,8 +1904,8 @@
       <w:r>
         <w:rPr>
           <w:rFonts w:ascii="Times New Roman" w:hAnsi="Times New Roman" w:cs="Times New Roman"/>
-          <w:sz w:val="28"/>
-          <w:szCs w:val="28"/>
+          <w:sz w:val="27"/>
+          <w:szCs w:val="27"/>
           <w:lang w:val="en-US"/>
         </w:rPr>
         <w:t>º</w:t>
@@ -2018,16 +1913,16 @@
       <w:r>
         <w:rPr>
           <w:rFonts w:ascii="Times New Roman" w:hAnsi="Times New Roman" w:cs="Times New Roman"/>
-          <w:sz w:val="28"/>
-          <w:szCs w:val="28"/>
+          <w:sz w:val="27"/>
+          <w:szCs w:val="27"/>
         </w:rPr>
         <w:t>С</w:t>
       </w:r>
       <w:r>
         <w:rPr>
           <w:rFonts w:ascii="Times New Roman" w:hAnsi="Times New Roman" w:cs="Times New Roman"/>
-          <w:sz w:val="28"/>
-          <w:szCs w:val="28"/>
+          <w:sz w:val="27"/>
+          <w:szCs w:val="27"/>
           <w:lang w:val="en-US"/>
         </w:rPr>
         <w:tab/>
@@ -2041,63 +1936,79 @@
         <w:jc w:val="both"/>
         <w:rPr>
           <w:rFonts w:ascii="Times New Roman" w:hAnsi="Times New Roman" w:cs="Times New Roman"/>
-          <w:sz w:val="28"/>
-          <w:szCs w:val="28"/>
-        </w:rPr>
-      </w:pPr>
-      <w:r>
-        <w:rPr>
-          <w:rFonts w:ascii="Times New Roman" w:hAnsi="Times New Roman" w:cs="Times New Roman"/>
-          <w:sz w:val="28"/>
-          <w:szCs w:val="28"/>
+          <w:sz w:val="27"/>
+          <w:szCs w:val="27"/>
+        </w:rPr>
+      </w:pPr>
+      <w:r>
+        <w:rPr>
+          <w:rFonts w:ascii="Times New Roman" w:hAnsi="Times New Roman" w:cs="Times New Roman"/>
+          <w:sz w:val="27"/>
+          <w:szCs w:val="27"/>
         </w:rPr>
         <w:t xml:space="preserve">3.1.3 Устройство должно </w:t>
       </w:r>
       <w:r>
         <w:rPr>
           <w:rFonts w:ascii="Times New Roman" w:hAnsi="Times New Roman" w:cs="Times New Roman"/>
-          <w:sz w:val="28"/>
-          <w:szCs w:val="28"/>
+          <w:sz w:val="27"/>
+          <w:szCs w:val="27"/>
         </w:rPr>
         <w:t>пита</w:t>
       </w:r>
       <w:r>
         <w:rPr>
           <w:rFonts w:ascii="Times New Roman" w:hAnsi="Times New Roman" w:cs="Times New Roman"/>
-          <w:sz w:val="28"/>
-          <w:szCs w:val="28"/>
+          <w:sz w:val="27"/>
+          <w:szCs w:val="27"/>
         </w:rPr>
         <w:t>ться</w:t>
       </w:r>
       <w:r>
         <w:rPr>
           <w:rFonts w:ascii="Times New Roman" w:hAnsi="Times New Roman" w:cs="Times New Roman"/>
-          <w:sz w:val="28"/>
-          <w:szCs w:val="28"/>
-        </w:rPr>
-        <w:t xml:space="preserve"> 5В и</w:t>
-      </w:r>
-      <w:r>
-        <w:rPr>
-          <w:rFonts w:ascii="Times New Roman" w:hAnsi="Times New Roman" w:cs="Times New Roman"/>
-          <w:sz w:val="28"/>
-          <w:szCs w:val="28"/>
+          <w:sz w:val="27"/>
+          <w:szCs w:val="27"/>
+        </w:rPr>
+        <w:t xml:space="preserve"> 5В</w:t>
+      </w:r>
+      <w:r>
+        <w:rPr>
+          <w:rFonts w:ascii="Times New Roman" w:hAnsi="Times New Roman" w:cs="Times New Roman"/>
+          <w:sz w:val="27"/>
+          <w:szCs w:val="27"/>
+        </w:rPr>
+        <w:t xml:space="preserve"> </w:t>
+      </w:r>
+      <w:r>
+        <w:rPr>
+          <w:rFonts w:ascii="Times New Roman" w:hAnsi="Times New Roman" w:cs="Times New Roman"/>
+          <w:sz w:val="27"/>
+          <w:szCs w:val="27"/>
+        </w:rPr>
+        <w:t>и</w:t>
+      </w:r>
+      <w:r>
+        <w:rPr>
+          <w:rFonts w:ascii="Times New Roman" w:hAnsi="Times New Roman" w:cs="Times New Roman"/>
+          <w:sz w:val="27"/>
+          <w:szCs w:val="27"/>
         </w:rPr>
         <w:t xml:space="preserve"> обеспечивать</w:t>
       </w:r>
       <w:r>
         <w:rPr>
           <w:rFonts w:ascii="Times New Roman" w:hAnsi="Times New Roman" w:cs="Times New Roman"/>
-          <w:sz w:val="28"/>
-          <w:szCs w:val="28"/>
+          <w:sz w:val="27"/>
+          <w:szCs w:val="27"/>
         </w:rPr>
         <w:t xml:space="preserve"> передачу данных по U</w:t>
       </w:r>
       <w:r>
         <w:rPr>
           <w:rFonts w:ascii="Times New Roman" w:hAnsi="Times New Roman" w:cs="Times New Roman"/>
-          <w:sz w:val="28"/>
-          <w:szCs w:val="28"/>
+          <w:sz w:val="27"/>
+          <w:szCs w:val="27"/>
           <w:lang w:val="en-US"/>
         </w:rPr>
         <w:t>SB</w:t>
@@ -2105,64 +2016,64 @@
       <w:r>
         <w:rPr>
           <w:rFonts w:ascii="Times New Roman" w:hAnsi="Times New Roman" w:cs="Times New Roman"/>
-          <w:sz w:val="28"/>
-          <w:szCs w:val="28"/>
+          <w:sz w:val="27"/>
+          <w:szCs w:val="27"/>
         </w:rPr>
         <w:t xml:space="preserve"> с </w:t>
       </w:r>
       <w:r>
         <w:rPr>
           <w:rFonts w:ascii="Times New Roman" w:hAnsi="Times New Roman" w:cs="Times New Roman"/>
-          <w:sz w:val="28"/>
-          <w:szCs w:val="28"/>
+          <w:sz w:val="27"/>
+          <w:szCs w:val="27"/>
         </w:rPr>
         <w:t>использованием</w:t>
       </w:r>
       <w:r>
         <w:rPr>
           <w:rFonts w:ascii="Times New Roman" w:hAnsi="Times New Roman" w:cs="Times New Roman"/>
-          <w:sz w:val="28"/>
-          <w:szCs w:val="28"/>
+          <w:sz w:val="27"/>
+          <w:szCs w:val="27"/>
         </w:rPr>
         <w:t xml:space="preserve"> </w:t>
       </w:r>
       <w:r>
         <w:rPr>
           <w:rFonts w:ascii="Times New Roman" w:hAnsi="Times New Roman" w:cs="Times New Roman"/>
-          <w:sz w:val="28"/>
-          <w:szCs w:val="28"/>
+          <w:sz w:val="27"/>
+          <w:szCs w:val="27"/>
         </w:rPr>
         <w:t>в</w:t>
       </w:r>
       <w:r>
         <w:rPr>
           <w:rFonts w:ascii="Times New Roman" w:hAnsi="Times New Roman" w:cs="Times New Roman"/>
-          <w:sz w:val="28"/>
-          <w:szCs w:val="28"/>
+          <w:sz w:val="27"/>
+          <w:szCs w:val="27"/>
         </w:rPr>
         <w:t>иртуальн</w:t>
       </w:r>
       <w:r>
         <w:rPr>
           <w:rFonts w:ascii="Times New Roman" w:hAnsi="Times New Roman" w:cs="Times New Roman"/>
-          <w:sz w:val="28"/>
-          <w:szCs w:val="28"/>
+          <w:sz w:val="27"/>
+          <w:szCs w:val="27"/>
         </w:rPr>
         <w:t>ого</w:t>
       </w:r>
       <w:r>
         <w:rPr>
           <w:rFonts w:ascii="Times New Roman" w:hAnsi="Times New Roman" w:cs="Times New Roman"/>
-          <w:sz w:val="28"/>
-          <w:szCs w:val="28"/>
+          <w:sz w:val="27"/>
+          <w:szCs w:val="27"/>
         </w:rPr>
         <w:t xml:space="preserve"> COM-порт</w:t>
       </w:r>
       <w:r>
         <w:rPr>
           <w:rFonts w:ascii="Times New Roman" w:hAnsi="Times New Roman" w:cs="Times New Roman"/>
-          <w:sz w:val="28"/>
-          <w:szCs w:val="28"/>
+          <w:sz w:val="27"/>
+          <w:szCs w:val="27"/>
         </w:rPr>
         <w:t xml:space="preserve">а. </w:t>
       </w:r>
@@ -2175,47 +2086,47 @@
         <w:jc w:val="both"/>
         <w:rPr>
           <w:rFonts w:ascii="Times New Roman" w:hAnsi="Times New Roman" w:cs="Times New Roman"/>
-          <w:sz w:val="28"/>
-          <w:szCs w:val="28"/>
-        </w:rPr>
-      </w:pPr>
-      <w:r>
-        <w:rPr>
-          <w:rFonts w:ascii="Times New Roman" w:hAnsi="Times New Roman" w:cs="Times New Roman"/>
-          <w:sz w:val="28"/>
-          <w:szCs w:val="28"/>
+          <w:sz w:val="27"/>
+          <w:szCs w:val="27"/>
+        </w:rPr>
+      </w:pPr>
+      <w:r>
+        <w:rPr>
+          <w:rFonts w:ascii="Times New Roman" w:hAnsi="Times New Roman" w:cs="Times New Roman"/>
+          <w:sz w:val="27"/>
+          <w:szCs w:val="27"/>
         </w:rPr>
         <w:t>3.1.4</w:t>
       </w:r>
       <w:r>
         <w:rPr>
           <w:rFonts w:ascii="Times New Roman" w:hAnsi="Times New Roman" w:cs="Times New Roman"/>
-          <w:sz w:val="28"/>
-          <w:szCs w:val="28"/>
+          <w:sz w:val="27"/>
+          <w:szCs w:val="27"/>
         </w:rPr>
         <w:tab/>
       </w:r>
       <w:r>
         <w:rPr>
           <w:rFonts w:ascii="Times New Roman" w:hAnsi="Times New Roman" w:cs="Times New Roman"/>
-          <w:sz w:val="28"/>
-          <w:szCs w:val="28"/>
+          <w:sz w:val="27"/>
+          <w:szCs w:val="27"/>
         </w:rPr>
         <w:t xml:space="preserve">Информация о </w:t>
       </w:r>
       <w:r>
         <w:rPr>
           <w:rFonts w:ascii="Times New Roman" w:hAnsi="Times New Roman" w:cs="Times New Roman"/>
-          <w:sz w:val="28"/>
-          <w:szCs w:val="28"/>
+          <w:sz w:val="27"/>
+          <w:szCs w:val="27"/>
         </w:rPr>
         <w:t>тестируемом</w:t>
       </w:r>
       <w:r>
         <w:rPr>
           <w:rFonts w:ascii="Times New Roman" w:hAnsi="Times New Roman" w:cs="Times New Roman"/>
-          <w:sz w:val="28"/>
-          <w:szCs w:val="28"/>
+          <w:sz w:val="27"/>
+          <w:szCs w:val="27"/>
         </w:rPr>
         <w:t xml:space="preserve"> компоненте должна содержать данные о типе компонента и последовательности подключенных выводов.</w:t>
       </w:r>
@@ -2228,31 +2139,31 @@
         <w:jc w:val="both"/>
         <w:rPr>
           <w:rFonts w:ascii="Times New Roman" w:hAnsi="Times New Roman" w:cs="Times New Roman"/>
-          <w:sz w:val="28"/>
-          <w:szCs w:val="28"/>
-        </w:rPr>
-      </w:pPr>
-      <w:r>
-        <w:rPr>
-          <w:rFonts w:ascii="Times New Roman" w:hAnsi="Times New Roman" w:cs="Times New Roman"/>
-          <w:sz w:val="28"/>
-          <w:szCs w:val="28"/>
+          <w:sz w:val="27"/>
+          <w:szCs w:val="27"/>
+        </w:rPr>
+      </w:pPr>
+      <w:r>
+        <w:rPr>
+          <w:rFonts w:ascii="Times New Roman" w:hAnsi="Times New Roman" w:cs="Times New Roman"/>
+          <w:sz w:val="27"/>
+          <w:szCs w:val="27"/>
         </w:rPr>
         <w:t>3.1.</w:t>
       </w:r>
       <w:r>
         <w:rPr>
           <w:rFonts w:ascii="Times New Roman" w:hAnsi="Times New Roman" w:cs="Times New Roman"/>
-          <w:sz w:val="28"/>
-          <w:szCs w:val="28"/>
+          <w:sz w:val="27"/>
+          <w:szCs w:val="27"/>
         </w:rPr>
         <w:t>5</w:t>
       </w:r>
       <w:r>
         <w:rPr>
           <w:rFonts w:ascii="Times New Roman" w:hAnsi="Times New Roman" w:cs="Times New Roman"/>
-          <w:sz w:val="28"/>
-          <w:szCs w:val="28"/>
+          <w:sz w:val="27"/>
+          <w:szCs w:val="27"/>
         </w:rPr>
         <w:tab/>
         <w:t xml:space="preserve">Печатная плата устройства не должна превышать габариты 75мм×75мм и соответствовать не более </w:t>
@@ -2260,16 +2171,16 @@
       <w:r>
         <w:rPr>
           <w:rFonts w:ascii="Times New Roman" w:hAnsi="Times New Roman" w:cs="Times New Roman"/>
-          <w:sz w:val="28"/>
-          <w:szCs w:val="28"/>
+          <w:sz w:val="27"/>
+          <w:szCs w:val="27"/>
         </w:rPr>
         <w:t>4</w:t>
       </w:r>
       <w:r>
         <w:rPr>
           <w:rFonts w:ascii="Times New Roman" w:hAnsi="Times New Roman" w:cs="Times New Roman"/>
-          <w:sz w:val="28"/>
-          <w:szCs w:val="28"/>
+          <w:sz w:val="27"/>
+          <w:szCs w:val="27"/>
         </w:rPr>
         <w:t>-му классу точности, а топологический рисунок должен быть выполнен не более чем в 2-х слоях.</w:t>
       </w:r>
@@ -2282,34 +2193,34 @@
         <w:jc w:val="both"/>
         <w:rPr>
           <w:rFonts w:ascii="Times New Roman" w:hAnsi="Times New Roman" w:cs="Times New Roman"/>
-          <w:sz w:val="28"/>
-          <w:szCs w:val="28"/>
-        </w:rPr>
-      </w:pPr>
-      <w:r>
-        <w:rPr>
-          <w:rFonts w:ascii="Times New Roman" w:hAnsi="Times New Roman" w:cs="Times New Roman"/>
-          <w:sz w:val="28"/>
-          <w:szCs w:val="28"/>
+          <w:sz w:val="27"/>
+          <w:szCs w:val="27"/>
+        </w:rPr>
+      </w:pPr>
+      <w:r>
+        <w:rPr>
+          <w:rFonts w:ascii="Times New Roman" w:hAnsi="Times New Roman" w:cs="Times New Roman"/>
+          <w:sz w:val="27"/>
+          <w:szCs w:val="27"/>
         </w:rPr>
         <w:t>3.1.</w:t>
       </w:r>
       <w:r>
         <w:rPr>
           <w:rFonts w:ascii="Times New Roman" w:hAnsi="Times New Roman" w:cs="Times New Roman"/>
-          <w:sz w:val="28"/>
-          <w:szCs w:val="28"/>
+          <w:sz w:val="27"/>
+          <w:szCs w:val="27"/>
         </w:rPr>
         <w:t>6</w:t>
       </w:r>
       <w:r>
         <w:rPr>
           <w:rFonts w:ascii="Times New Roman" w:hAnsi="Times New Roman" w:cs="Times New Roman"/>
-          <w:sz w:val="28"/>
-          <w:szCs w:val="28"/>
+          <w:sz w:val="27"/>
+          <w:szCs w:val="27"/>
         </w:rPr>
         <w:tab/>
-        <w:t>Устройство должно быть построено на базе микросхем отечественного производства (или имеющих отечественные аналоги), таких как стандартной логики, операционных усилителях и аналого-цифровых преобразователях, а также дискретных компонентах. При разработке устройства не допускается применять программируемые интегральные микросхемы или интегральные микросхемы специального назначения.</w:t>
+        <w:t>Правильность работы разработанного устройства должна быть подтверждена результатами схемотехнического моделирования в одном из доступных программных пакетов на базе SPICE моделей.</w:t>
       </w:r>
     </w:p>
     <w:p>
@@ -2320,35 +2231,34 @@
         <w:jc w:val="both"/>
         <w:rPr>
           <w:rFonts w:ascii="Times New Roman" w:hAnsi="Times New Roman" w:cs="Times New Roman"/>
-          <w:sz w:val="28"/>
-          <w:szCs w:val="28"/>
-        </w:rPr>
-      </w:pPr>
-      <w:r>
-        <w:rPr>
-          <w:rFonts w:ascii="Times New Roman" w:hAnsi="Times New Roman" w:cs="Times New Roman"/>
-          <w:sz w:val="28"/>
-          <w:szCs w:val="28"/>
-        </w:rPr>
-        <w:lastRenderedPageBreak/>
-        <w:t>3.1.</w:t>
-      </w:r>
-      <w:r>
-        <w:rPr>
-          <w:rFonts w:ascii="Times New Roman" w:hAnsi="Times New Roman" w:cs="Times New Roman"/>
-          <w:sz w:val="28"/>
-          <w:szCs w:val="28"/>
-        </w:rPr>
-        <w:t>7</w:t>
-      </w:r>
-      <w:r>
-        <w:rPr>
-          <w:rFonts w:ascii="Times New Roman" w:hAnsi="Times New Roman" w:cs="Times New Roman"/>
-          <w:sz w:val="28"/>
-          <w:szCs w:val="28"/>
+          <w:sz w:val="27"/>
+          <w:szCs w:val="27"/>
+        </w:rPr>
+      </w:pPr>
+      <w:r>
+        <w:rPr>
+          <w:rFonts w:ascii="Times New Roman" w:hAnsi="Times New Roman" w:cs="Times New Roman"/>
+          <w:sz w:val="27"/>
+          <w:szCs w:val="27"/>
+        </w:rPr>
+        <w:t>3.</w:t>
+      </w:r>
+      <w:r>
+        <w:rPr>
+          <w:rFonts w:ascii="Times New Roman" w:hAnsi="Times New Roman" w:cs="Times New Roman"/>
+          <w:sz w:val="27"/>
+          <w:szCs w:val="27"/>
+        </w:rPr>
+        <w:t>2</w:t>
+      </w:r>
+      <w:r>
+        <w:rPr>
+          <w:rFonts w:ascii="Times New Roman" w:hAnsi="Times New Roman" w:cs="Times New Roman"/>
+          <w:sz w:val="27"/>
+          <w:szCs w:val="27"/>
         </w:rPr>
         <w:tab/>
-        <w:t>Правильность работы разработанного устройства должна быть подтверждена результатами схемотехнического моделирования в одном из доступных программных пакетов на базе SPICE моделей.</w:t>
+        <w:t>Требования к способам и точности обработки результатов исследований.</w:t>
       </w:r>
     </w:p>
     <w:p>
@@ -2359,26 +2269,17 @@
         <w:jc w:val="both"/>
         <w:rPr>
           <w:rFonts w:ascii="Times New Roman" w:hAnsi="Times New Roman" w:cs="Times New Roman"/>
-          <w:sz w:val="28"/>
-          <w:szCs w:val="28"/>
-        </w:rPr>
-      </w:pPr>
-      <w:r>
-        <w:rPr>
-          <w:rFonts w:ascii="Times New Roman" w:hAnsi="Times New Roman" w:cs="Times New Roman"/>
-          <w:sz w:val="28"/>
-          <w:szCs w:val="28"/>
-        </w:rPr>
-        <w:t>3.2</w:t>
-      </w:r>
-      <w:r>
-        <w:rPr>
-          <w:rFonts w:ascii="Times New Roman" w:hAnsi="Times New Roman" w:cs="Times New Roman"/>
-          <w:sz w:val="28"/>
-          <w:szCs w:val="28"/>
-        </w:rPr>
-        <w:tab/>
-        <w:t>Требования к математическому обеспечению.</w:t>
+          <w:sz w:val="27"/>
+          <w:szCs w:val="27"/>
+        </w:rPr>
+      </w:pPr>
+      <w:r>
+        <w:rPr>
+          <w:rFonts w:ascii="Times New Roman" w:hAnsi="Times New Roman" w:cs="Times New Roman"/>
+          <w:sz w:val="27"/>
+          <w:szCs w:val="27"/>
+        </w:rPr>
+        <w:t>Не предъявляются.</w:t>
       </w:r>
     </w:p>
     <w:p>
@@ -2389,17 +2290,34 @@
         <w:jc w:val="both"/>
         <w:rPr>
           <w:rFonts w:ascii="Times New Roman" w:hAnsi="Times New Roman" w:cs="Times New Roman"/>
-          <w:sz w:val="28"/>
-          <w:szCs w:val="28"/>
-        </w:rPr>
-      </w:pPr>
-      <w:r>
-        <w:rPr>
-          <w:rFonts w:ascii="Times New Roman" w:hAnsi="Times New Roman" w:cs="Times New Roman"/>
-          <w:sz w:val="28"/>
-          <w:szCs w:val="28"/>
-        </w:rPr>
-        <w:t>Разработка программного обеспечения для автоматизированной подготовки топологической информации СБИС при заказе фотошаблонов должно осуществляться с учетом архитектуры сложных электронно-вычислительных систем, теории графов, базового математического аппарата, теории реляционных баз данных и проектирования сложного программного обеспечения и программных систем.</w:t>
+          <w:sz w:val="27"/>
+          <w:szCs w:val="27"/>
+        </w:rPr>
+      </w:pPr>
+      <w:r>
+        <w:rPr>
+          <w:rFonts w:ascii="Times New Roman" w:hAnsi="Times New Roman" w:cs="Times New Roman"/>
+          <w:sz w:val="27"/>
+          <w:szCs w:val="27"/>
+        </w:rPr>
+        <w:t>3.</w:t>
+      </w:r>
+      <w:r>
+        <w:rPr>
+          <w:rFonts w:ascii="Times New Roman" w:hAnsi="Times New Roman" w:cs="Times New Roman"/>
+          <w:sz w:val="27"/>
+          <w:szCs w:val="27"/>
+        </w:rPr>
+        <w:t>3</w:t>
+      </w:r>
+      <w:r>
+        <w:rPr>
+          <w:rFonts w:ascii="Times New Roman" w:hAnsi="Times New Roman" w:cs="Times New Roman"/>
+          <w:sz w:val="27"/>
+          <w:szCs w:val="27"/>
+        </w:rPr>
+        <w:tab/>
+        <w:t>Требования к проведению моделирования.</w:t>
       </w:r>
     </w:p>
     <w:p>
@@ -2410,26 +2328,17 @@
         <w:jc w:val="both"/>
         <w:rPr>
           <w:rFonts w:ascii="Times New Roman" w:hAnsi="Times New Roman" w:cs="Times New Roman"/>
-          <w:sz w:val="28"/>
-          <w:szCs w:val="28"/>
-        </w:rPr>
-      </w:pPr>
-      <w:r>
-        <w:rPr>
-          <w:rFonts w:ascii="Times New Roman" w:hAnsi="Times New Roman" w:cs="Times New Roman"/>
-          <w:sz w:val="28"/>
-          <w:szCs w:val="28"/>
-        </w:rPr>
-        <w:t>3.3</w:t>
-      </w:r>
-      <w:r>
-        <w:rPr>
-          <w:rFonts w:ascii="Times New Roman" w:hAnsi="Times New Roman" w:cs="Times New Roman"/>
-          <w:sz w:val="28"/>
-          <w:szCs w:val="28"/>
-        </w:rPr>
-        <w:tab/>
-        <w:t>Требования к способам и точности обработки результатов исследований.</w:t>
+          <w:sz w:val="27"/>
+          <w:szCs w:val="27"/>
+        </w:rPr>
+      </w:pPr>
+      <w:r>
+        <w:rPr>
+          <w:rFonts w:ascii="Times New Roman" w:hAnsi="Times New Roman" w:cs="Times New Roman"/>
+          <w:sz w:val="27"/>
+          <w:szCs w:val="27"/>
+        </w:rPr>
+        <w:t>Не предъявляются.</w:t>
       </w:r>
     </w:p>
     <w:p>
@@ -2440,17 +2349,34 @@
         <w:jc w:val="both"/>
         <w:rPr>
           <w:rFonts w:ascii="Times New Roman" w:hAnsi="Times New Roman" w:cs="Times New Roman"/>
-          <w:sz w:val="28"/>
-          <w:szCs w:val="28"/>
-        </w:rPr>
-      </w:pPr>
-      <w:r>
-        <w:rPr>
-          <w:rFonts w:ascii="Times New Roman" w:hAnsi="Times New Roman" w:cs="Times New Roman"/>
-          <w:sz w:val="28"/>
-          <w:szCs w:val="28"/>
-        </w:rPr>
-        <w:t>Не предъявляются.</w:t>
+          <w:sz w:val="27"/>
+          <w:szCs w:val="27"/>
+        </w:rPr>
+      </w:pPr>
+      <w:r>
+        <w:rPr>
+          <w:rFonts w:ascii="Times New Roman" w:hAnsi="Times New Roman" w:cs="Times New Roman"/>
+          <w:sz w:val="27"/>
+          <w:szCs w:val="27"/>
+        </w:rPr>
+        <w:t>3.</w:t>
+      </w:r>
+      <w:r>
+        <w:rPr>
+          <w:rFonts w:ascii="Times New Roman" w:hAnsi="Times New Roman" w:cs="Times New Roman"/>
+          <w:sz w:val="27"/>
+          <w:szCs w:val="27"/>
+        </w:rPr>
+        <w:t>4</w:t>
+      </w:r>
+      <w:r>
+        <w:rPr>
+          <w:rFonts w:ascii="Times New Roman" w:hAnsi="Times New Roman" w:cs="Times New Roman"/>
+          <w:sz w:val="27"/>
+          <w:szCs w:val="27"/>
+        </w:rPr>
+        <w:tab/>
+        <w:t>Требования к проведению патентных исследований и составлению отчета о них.</w:t>
       </w:r>
     </w:p>
     <w:p>
@@ -2461,26 +2387,17 @@
         <w:jc w:val="both"/>
         <w:rPr>
           <w:rFonts w:ascii="Times New Roman" w:hAnsi="Times New Roman" w:cs="Times New Roman"/>
-          <w:sz w:val="28"/>
-          <w:szCs w:val="28"/>
-        </w:rPr>
-      </w:pPr>
-      <w:r>
-        <w:rPr>
-          <w:rFonts w:ascii="Times New Roman" w:hAnsi="Times New Roman" w:cs="Times New Roman"/>
-          <w:sz w:val="28"/>
-          <w:szCs w:val="28"/>
-        </w:rPr>
-        <w:t>3.4</w:t>
-      </w:r>
-      <w:r>
-        <w:rPr>
-          <w:rFonts w:ascii="Times New Roman" w:hAnsi="Times New Roman" w:cs="Times New Roman"/>
-          <w:sz w:val="28"/>
-          <w:szCs w:val="28"/>
-        </w:rPr>
-        <w:tab/>
-        <w:t>Требования к проведению моделирования.</w:t>
+          <w:sz w:val="27"/>
+          <w:szCs w:val="27"/>
+        </w:rPr>
+      </w:pPr>
+      <w:r>
+        <w:rPr>
+          <w:rFonts w:ascii="Times New Roman" w:hAnsi="Times New Roman" w:cs="Times New Roman"/>
+          <w:sz w:val="27"/>
+          <w:szCs w:val="27"/>
+        </w:rPr>
+        <w:t>В ходе выполнения курсовой работы проведение проверки патентной чистоты разработанного подхода не требуется.</w:t>
       </w:r>
     </w:p>
     <w:p>
@@ -2491,17 +2408,36 @@
         <w:jc w:val="both"/>
         <w:rPr>
           <w:rFonts w:ascii="Times New Roman" w:hAnsi="Times New Roman" w:cs="Times New Roman"/>
-          <w:sz w:val="28"/>
-          <w:szCs w:val="28"/>
-        </w:rPr>
-      </w:pPr>
-      <w:r>
-        <w:rPr>
-          <w:rFonts w:ascii="Times New Roman" w:hAnsi="Times New Roman" w:cs="Times New Roman"/>
-          <w:sz w:val="28"/>
-          <w:szCs w:val="28"/>
-        </w:rPr>
-        <w:t>Не предъявляются.</w:t>
+          <w:sz w:val="27"/>
+          <w:szCs w:val="27"/>
+        </w:rPr>
+      </w:pPr>
+      <w:r>
+        <w:rPr>
+          <w:rFonts w:ascii="Times New Roman" w:hAnsi="Times New Roman" w:cs="Times New Roman"/>
+          <w:sz w:val="27"/>
+          <w:szCs w:val="27"/>
+        </w:rPr>
+        <w:lastRenderedPageBreak/>
+        <w:t xml:space="preserve">Государственная регистрация программы для ЭВМ в едином реестре программного обеспечения </w:t>
+      </w:r>
+      <w:proofErr w:type="spellStart"/>
+      <w:r>
+        <w:rPr>
+          <w:rFonts w:ascii="Times New Roman" w:hAnsi="Times New Roman" w:cs="Times New Roman"/>
+          <w:sz w:val="27"/>
+          <w:szCs w:val="27"/>
+        </w:rPr>
+        <w:t>РосПатента</w:t>
+      </w:r>
+      <w:proofErr w:type="spellEnd"/>
+      <w:r>
+        <w:rPr>
+          <w:rFonts w:ascii="Times New Roman" w:hAnsi="Times New Roman" w:cs="Times New Roman"/>
+          <w:sz w:val="27"/>
+          <w:szCs w:val="27"/>
+        </w:rPr>
+        <w:t xml:space="preserve"> не требуется.</w:t>
       </w:r>
     </w:p>
     <w:p>
@@ -2512,26 +2448,34 @@
         <w:jc w:val="both"/>
         <w:rPr>
           <w:rFonts w:ascii="Times New Roman" w:hAnsi="Times New Roman" w:cs="Times New Roman"/>
-          <w:sz w:val="28"/>
-          <w:szCs w:val="28"/>
-        </w:rPr>
-      </w:pPr>
-      <w:r>
-        <w:rPr>
-          <w:rFonts w:ascii="Times New Roman" w:hAnsi="Times New Roman" w:cs="Times New Roman"/>
-          <w:sz w:val="28"/>
-          <w:szCs w:val="28"/>
-        </w:rPr>
-        <w:t>3.5</w:t>
-      </w:r>
-      <w:r>
-        <w:rPr>
-          <w:rFonts w:ascii="Times New Roman" w:hAnsi="Times New Roman" w:cs="Times New Roman"/>
-          <w:sz w:val="28"/>
-          <w:szCs w:val="28"/>
+          <w:sz w:val="27"/>
+          <w:szCs w:val="27"/>
+        </w:rPr>
+      </w:pPr>
+      <w:r>
+        <w:rPr>
+          <w:rFonts w:ascii="Times New Roman" w:hAnsi="Times New Roman" w:cs="Times New Roman"/>
+          <w:sz w:val="27"/>
+          <w:szCs w:val="27"/>
+        </w:rPr>
+        <w:t>3.</w:t>
+      </w:r>
+      <w:r>
+        <w:rPr>
+          <w:rFonts w:ascii="Times New Roman" w:hAnsi="Times New Roman" w:cs="Times New Roman"/>
+          <w:sz w:val="27"/>
+          <w:szCs w:val="27"/>
+        </w:rPr>
+        <w:t>5</w:t>
+      </w:r>
+      <w:r>
+        <w:rPr>
+          <w:rFonts w:ascii="Times New Roman" w:hAnsi="Times New Roman" w:cs="Times New Roman"/>
+          <w:sz w:val="27"/>
+          <w:szCs w:val="27"/>
         </w:rPr>
         <w:tab/>
-        <w:t>Требования к проведению патентных исследований и составлению отчета о них.</w:t>
+        <w:t>Предполагаемые результаты курсовой работы</w:t>
       </w:r>
     </w:p>
     <w:p>
@@ -2542,105 +2486,15 @@
         <w:jc w:val="both"/>
         <w:rPr>
           <w:rFonts w:ascii="Times New Roman" w:hAnsi="Times New Roman" w:cs="Times New Roman"/>
-          <w:sz w:val="28"/>
-          <w:szCs w:val="28"/>
-        </w:rPr>
-      </w:pPr>
-      <w:r>
-        <w:rPr>
-          <w:rFonts w:ascii="Times New Roman" w:hAnsi="Times New Roman" w:cs="Times New Roman"/>
-          <w:sz w:val="28"/>
-          <w:szCs w:val="28"/>
-        </w:rPr>
-        <w:t>В ходе выполнения курсовой работы проведение проверки патентной чистоты разработанного подхода не требуется.</w:t>
-      </w:r>
-    </w:p>
-    <w:p>
-      <w:pPr>
-        <w:pStyle w:val="a4"/>
-        <w:spacing w:line="360" w:lineRule="auto"/>
-        <w:ind w:left="0" w:firstLine="709"/>
-        <w:jc w:val="both"/>
-        <w:rPr>
-          <w:rFonts w:ascii="Times New Roman" w:hAnsi="Times New Roman" w:cs="Times New Roman"/>
-          <w:sz w:val="28"/>
-          <w:szCs w:val="28"/>
-        </w:rPr>
-      </w:pPr>
-      <w:r>
-        <w:rPr>
-          <w:rFonts w:ascii="Times New Roman" w:hAnsi="Times New Roman" w:cs="Times New Roman"/>
-          <w:sz w:val="28"/>
-          <w:szCs w:val="28"/>
-        </w:rPr>
-        <w:t xml:space="preserve">Государственная регистрация программы для ЭВМ в едином реестре программного обеспечения </w:t>
-      </w:r>
-      <w:proofErr w:type="spellStart"/>
-      <w:r>
-        <w:rPr>
-          <w:rFonts w:ascii="Times New Roman" w:hAnsi="Times New Roman" w:cs="Times New Roman"/>
-          <w:sz w:val="28"/>
-          <w:szCs w:val="28"/>
-        </w:rPr>
-        <w:t>РосПатента</w:t>
-      </w:r>
-      <w:proofErr w:type="spellEnd"/>
-      <w:r>
-        <w:rPr>
-          <w:rFonts w:ascii="Times New Roman" w:hAnsi="Times New Roman" w:cs="Times New Roman"/>
-          <w:sz w:val="28"/>
-          <w:szCs w:val="28"/>
-        </w:rPr>
-        <w:t xml:space="preserve"> не требуется.</w:t>
-      </w:r>
-    </w:p>
-    <w:p>
-      <w:pPr>
-        <w:pStyle w:val="a4"/>
-        <w:spacing w:line="360" w:lineRule="auto"/>
-        <w:ind w:left="0" w:firstLine="709"/>
-        <w:jc w:val="both"/>
-        <w:rPr>
-          <w:rFonts w:ascii="Times New Roman" w:hAnsi="Times New Roman" w:cs="Times New Roman"/>
-          <w:sz w:val="28"/>
-          <w:szCs w:val="28"/>
-        </w:rPr>
-      </w:pPr>
-      <w:r>
-        <w:rPr>
-          <w:rFonts w:ascii="Times New Roman" w:hAnsi="Times New Roman" w:cs="Times New Roman"/>
-          <w:sz w:val="28"/>
-          <w:szCs w:val="28"/>
-        </w:rPr>
-        <w:t>3.6</w:t>
-      </w:r>
-      <w:r>
-        <w:rPr>
-          <w:rFonts w:ascii="Times New Roman" w:hAnsi="Times New Roman" w:cs="Times New Roman"/>
-          <w:sz w:val="28"/>
-          <w:szCs w:val="28"/>
-        </w:rPr>
-        <w:tab/>
-        <w:t>Предполагаемые результаты курсовой работы</w:t>
-      </w:r>
-    </w:p>
-    <w:p>
-      <w:pPr>
-        <w:pStyle w:val="a4"/>
-        <w:spacing w:line="360" w:lineRule="auto"/>
-        <w:ind w:left="0" w:firstLine="709"/>
-        <w:jc w:val="both"/>
-        <w:rPr>
-          <w:rFonts w:ascii="Times New Roman" w:hAnsi="Times New Roman" w:cs="Times New Roman"/>
-          <w:sz w:val="28"/>
-          <w:szCs w:val="28"/>
-        </w:rPr>
-      </w:pPr>
-      <w:r>
-        <w:rPr>
-          <w:rFonts w:ascii="Times New Roman" w:hAnsi="Times New Roman" w:cs="Times New Roman"/>
-          <w:sz w:val="28"/>
-          <w:szCs w:val="28"/>
+          <w:sz w:val="27"/>
+          <w:szCs w:val="27"/>
+        </w:rPr>
+      </w:pPr>
+      <w:r>
+        <w:rPr>
+          <w:rFonts w:ascii="Times New Roman" w:hAnsi="Times New Roman" w:cs="Times New Roman"/>
+          <w:sz w:val="27"/>
+          <w:szCs w:val="27"/>
         </w:rPr>
         <w:t>В результате выполнения курсовой работы должны быть получены следующие результаты:</w:t>
       </w:r>
@@ -2658,73 +2512,37 @@
         <w:jc w:val="both"/>
         <w:rPr>
           <w:rFonts w:ascii="Times New Roman" w:eastAsia="Times New Roman" w:hAnsi="Times New Roman" w:cs="Times New Roman"/>
-          <w:sz w:val="28"/>
-          <w:szCs w:val="28"/>
+          <w:sz w:val="27"/>
+          <w:szCs w:val="27"/>
           <w:lang w:eastAsia="ru-RU"/>
         </w:rPr>
       </w:pPr>
       <w:r>
         <w:rPr>
           <w:rFonts w:ascii="Times New Roman" w:eastAsia="Times New Roman" w:hAnsi="Times New Roman" w:cs="Times New Roman"/>
-          <w:sz w:val="28"/>
-          <w:szCs w:val="28"/>
+          <w:sz w:val="27"/>
+          <w:szCs w:val="27"/>
           <w:lang w:eastAsia="ru-RU"/>
         </w:rPr>
-        <w:t>по п.2 подготовлен сравнительный анализ существующих решений и</w:t>
+        <w:t>по п.2 подготовлен сравнительный анализ существующих решений и устройств «</w:t>
       </w:r>
       <w:r>
         <w:rPr>
           <w:rFonts w:ascii="Times New Roman" w:eastAsia="Times New Roman" w:hAnsi="Times New Roman" w:cs="Times New Roman"/>
-          <w:sz w:val="28"/>
-          <w:szCs w:val="28"/>
+          <w:sz w:val="27"/>
+          <w:szCs w:val="27"/>
           <w:lang w:eastAsia="ru-RU"/>
         </w:rPr>
-        <w:t xml:space="preserve"> </w:t>
+        <w:t>Тестер компонентов на базе микроконтроллера STM32</w:t>
       </w:r>
       <w:r>
         <w:rPr>
           <w:rFonts w:ascii="Times New Roman" w:eastAsia="Times New Roman" w:hAnsi="Times New Roman" w:cs="Times New Roman"/>
-          <w:sz w:val="28"/>
-          <w:szCs w:val="28"/>
+          <w:sz w:val="27"/>
+          <w:szCs w:val="27"/>
           <w:lang w:eastAsia="ru-RU"/>
         </w:rPr>
-        <w:t>устройств «</w:t>
-      </w:r>
-      <w:r>
-        <w:rPr>
-          <w:rFonts w:ascii="Times New Roman" w:eastAsia="Times New Roman" w:hAnsi="Times New Roman" w:cs="Times New Roman"/>
-          <w:sz w:val="28"/>
-          <w:szCs w:val="28"/>
-          <w:lang w:eastAsia="ru-RU"/>
-        </w:rPr>
-        <w:t>Тестер компонентов</w:t>
-      </w:r>
-      <w:r>
-        <w:rPr>
-          <w:rFonts w:ascii="Times New Roman" w:eastAsia="Times New Roman" w:hAnsi="Times New Roman" w:cs="Times New Roman"/>
-          <w:sz w:val="28"/>
-          <w:szCs w:val="28"/>
-          <w:lang w:eastAsia="ru-RU"/>
-        </w:rPr>
-        <w:t>». Выявлены наилучшие имеющиеся</w:t>
-      </w:r>
-      <w:r>
-        <w:rPr>
-          <w:rFonts w:ascii="Times New Roman" w:eastAsia="Times New Roman" w:hAnsi="Times New Roman" w:cs="Times New Roman"/>
-          <w:sz w:val="28"/>
-          <w:szCs w:val="28"/>
-          <w:lang w:eastAsia="ru-RU"/>
-        </w:rPr>
-        <w:t xml:space="preserve"> </w:t>
-      </w:r>
-      <w:r>
-        <w:rPr>
-          <w:rFonts w:ascii="Times New Roman" w:eastAsia="Times New Roman" w:hAnsi="Times New Roman" w:cs="Times New Roman"/>
-          <w:sz w:val="28"/>
-          <w:szCs w:val="28"/>
-          <w:lang w:eastAsia="ru-RU"/>
-        </w:rPr>
-        <w:t>решения, а также существующие проблемы.</w:t>
+        <w:t>». Выявлены наилучшие имеющиеся решения, а также существующие проблемы.</w:t>
       </w:r>
     </w:p>
     <w:p>
@@ -2740,127 +2558,37 @@
         <w:jc w:val="both"/>
         <w:rPr>
           <w:rFonts w:ascii="Times New Roman" w:eastAsia="Times New Roman" w:hAnsi="Times New Roman" w:cs="Times New Roman"/>
-          <w:sz w:val="28"/>
-          <w:szCs w:val="28"/>
+          <w:sz w:val="27"/>
+          <w:szCs w:val="27"/>
           <w:lang w:eastAsia="ru-RU"/>
         </w:rPr>
       </w:pPr>
       <w:r>
         <w:rPr>
           <w:rFonts w:ascii="Times New Roman" w:eastAsia="Times New Roman" w:hAnsi="Times New Roman" w:cs="Times New Roman"/>
-          <w:sz w:val="28"/>
-          <w:szCs w:val="28"/>
+          <w:sz w:val="27"/>
+          <w:szCs w:val="27"/>
           <w:lang w:eastAsia="ru-RU"/>
         </w:rPr>
-        <w:t>по</w:t>
+        <w:t xml:space="preserve">по п.3.1 разработано </w:t>
       </w:r>
       <w:r>
         <w:rPr>
           <w:rFonts w:ascii="Times New Roman" w:eastAsia="Times New Roman" w:hAnsi="Times New Roman" w:cs="Times New Roman"/>
-          <w:sz w:val="28"/>
-          <w:szCs w:val="28"/>
+          <w:sz w:val="27"/>
+          <w:szCs w:val="27"/>
           <w:lang w:eastAsia="ru-RU"/>
         </w:rPr>
-        <w:t xml:space="preserve"> </w:t>
+        <w:t>устройство,</w:t>
       </w:r>
       <w:r>
         <w:rPr>
           <w:rFonts w:ascii="Times New Roman" w:eastAsia="Times New Roman" w:hAnsi="Times New Roman" w:cs="Times New Roman"/>
-          <w:sz w:val="28"/>
-          <w:szCs w:val="28"/>
+          <w:sz w:val="27"/>
+          <w:szCs w:val="27"/>
           <w:lang w:eastAsia="ru-RU"/>
         </w:rPr>
-        <w:t>п.3.1</w:t>
-      </w:r>
-      <w:r>
-        <w:rPr>
-          <w:rFonts w:ascii="Times New Roman" w:eastAsia="Times New Roman" w:hAnsi="Times New Roman" w:cs="Times New Roman"/>
-          <w:sz w:val="28"/>
-          <w:szCs w:val="28"/>
-          <w:lang w:eastAsia="ru-RU"/>
-        </w:rPr>
-        <w:t xml:space="preserve"> </w:t>
-      </w:r>
-      <w:r>
-        <w:rPr>
-          <w:rFonts w:ascii="Times New Roman" w:eastAsia="Times New Roman" w:hAnsi="Times New Roman" w:cs="Times New Roman"/>
-          <w:sz w:val="28"/>
-          <w:szCs w:val="28"/>
-          <w:lang w:eastAsia="ru-RU"/>
-        </w:rPr>
-        <w:t>разработано</w:t>
-      </w:r>
-      <w:r>
-        <w:rPr>
-          <w:rFonts w:ascii="Times New Roman" w:eastAsia="Times New Roman" w:hAnsi="Times New Roman" w:cs="Times New Roman"/>
-          <w:sz w:val="28"/>
-          <w:szCs w:val="28"/>
-          <w:lang w:eastAsia="ru-RU"/>
-        </w:rPr>
-        <w:t xml:space="preserve"> </w:t>
-      </w:r>
-      <w:r>
-        <w:rPr>
-          <w:rFonts w:ascii="Times New Roman" w:eastAsia="Times New Roman" w:hAnsi="Times New Roman" w:cs="Times New Roman"/>
-          <w:sz w:val="28"/>
-          <w:szCs w:val="28"/>
-          <w:lang w:eastAsia="ru-RU"/>
-        </w:rPr>
-        <w:t>устройство,</w:t>
-      </w:r>
-      <w:r>
-        <w:rPr>
-          <w:rFonts w:ascii="Times New Roman" w:eastAsia="Times New Roman" w:hAnsi="Times New Roman" w:cs="Times New Roman"/>
-          <w:sz w:val="28"/>
-          <w:szCs w:val="28"/>
-          <w:lang w:eastAsia="ru-RU"/>
-        </w:rPr>
-        <w:t xml:space="preserve"> </w:t>
-      </w:r>
-      <w:r>
-        <w:rPr>
-          <w:rFonts w:ascii="Times New Roman" w:eastAsia="Times New Roman" w:hAnsi="Times New Roman" w:cs="Times New Roman"/>
-          <w:sz w:val="28"/>
-          <w:szCs w:val="28"/>
-          <w:lang w:eastAsia="ru-RU"/>
-        </w:rPr>
-        <w:t>соответствующее</w:t>
-      </w:r>
-      <w:r>
-        <w:rPr>
-          <w:rFonts w:ascii="Times New Roman" w:eastAsia="Times New Roman" w:hAnsi="Times New Roman" w:cs="Times New Roman"/>
-          <w:sz w:val="28"/>
-          <w:szCs w:val="28"/>
-          <w:lang w:eastAsia="ru-RU"/>
-        </w:rPr>
-        <w:t xml:space="preserve"> </w:t>
-      </w:r>
-      <w:r>
-        <w:rPr>
-          <w:rFonts w:ascii="Times New Roman" w:eastAsia="Times New Roman" w:hAnsi="Times New Roman" w:cs="Times New Roman"/>
-          <w:sz w:val="28"/>
-          <w:szCs w:val="28"/>
-          <w:lang w:eastAsia="ru-RU"/>
-        </w:rPr>
-        <w:t>требованиям</w:t>
-      </w:r>
-      <w:r>
-        <w:rPr>
-          <w:rFonts w:ascii="Times New Roman" w:eastAsia="Times New Roman" w:hAnsi="Times New Roman" w:cs="Times New Roman"/>
-          <w:sz w:val="28"/>
-          <w:szCs w:val="28"/>
-          <w:lang w:eastAsia="ru-RU"/>
-        </w:rPr>
-        <w:t xml:space="preserve"> </w:t>
-      </w:r>
-      <w:r>
-        <w:rPr>
-          <w:rFonts w:ascii="Times New Roman" w:eastAsia="Times New Roman" w:hAnsi="Times New Roman" w:cs="Times New Roman"/>
-          <w:sz w:val="28"/>
-          <w:szCs w:val="28"/>
-          <w:lang w:eastAsia="ru-RU"/>
-        </w:rPr>
-        <w:t>расширенного технического задания.</w:t>
+        <w:t xml:space="preserve"> соответствующее требованиям расширенного технического задания.</w:t>
       </w:r>
     </w:p>
     <w:p>
@@ -2871,23 +2599,31 @@
         <w:jc w:val="both"/>
         <w:rPr>
           <w:rFonts w:ascii="Times New Roman" w:hAnsi="Times New Roman" w:cs="Times New Roman"/>
-          <w:sz w:val="28"/>
-          <w:szCs w:val="28"/>
-        </w:rPr>
-      </w:pPr>
-      <w:r>
-        <w:rPr>
-          <w:rFonts w:ascii="Times New Roman" w:hAnsi="Times New Roman" w:cs="Times New Roman"/>
-          <w:sz w:val="28"/>
-          <w:szCs w:val="28"/>
-        </w:rPr>
-        <w:t>3.7</w:t>
-      </w:r>
-      <w:r>
-        <w:rPr>
-          <w:rFonts w:ascii="Times New Roman" w:hAnsi="Times New Roman" w:cs="Times New Roman"/>
-          <w:sz w:val="28"/>
-          <w:szCs w:val="28"/>
+          <w:sz w:val="27"/>
+          <w:szCs w:val="27"/>
+        </w:rPr>
+      </w:pPr>
+      <w:r>
+        <w:rPr>
+          <w:rFonts w:ascii="Times New Roman" w:hAnsi="Times New Roman" w:cs="Times New Roman"/>
+          <w:sz w:val="27"/>
+          <w:szCs w:val="27"/>
+        </w:rPr>
+        <w:t>3.</w:t>
+      </w:r>
+      <w:r>
+        <w:rPr>
+          <w:rFonts w:ascii="Times New Roman" w:hAnsi="Times New Roman" w:cs="Times New Roman"/>
+          <w:sz w:val="27"/>
+          <w:szCs w:val="27"/>
+        </w:rPr>
+        <w:t>6</w:t>
+      </w:r>
+      <w:r>
+        <w:rPr>
+          <w:rFonts w:ascii="Times New Roman" w:hAnsi="Times New Roman" w:cs="Times New Roman"/>
+          <w:sz w:val="27"/>
+          <w:szCs w:val="27"/>
         </w:rPr>
         <w:tab/>
         <w:t>Необходимость разработки, изготовления и испытаний макетов</w:t>
@@ -2895,8 +2631,8 @@
       <w:r>
         <w:rPr>
           <w:rFonts w:ascii="Times New Roman" w:hAnsi="Times New Roman" w:cs="Times New Roman"/>
-          <w:sz w:val="28"/>
-          <w:szCs w:val="28"/>
+          <w:sz w:val="27"/>
+          <w:szCs w:val="27"/>
         </w:rPr>
         <w:t>.</w:t>
       </w:r>
@@ -2909,17 +2645,16 @@
         <w:jc w:val="both"/>
         <w:rPr>
           <w:rFonts w:ascii="Times New Roman" w:hAnsi="Times New Roman" w:cs="Times New Roman"/>
-          <w:sz w:val="28"/>
-          <w:szCs w:val="28"/>
-        </w:rPr>
-      </w:pPr>
-      <w:r>
-        <w:rPr>
-          <w:rFonts w:ascii="Times New Roman" w:hAnsi="Times New Roman" w:cs="Times New Roman"/>
-          <w:sz w:val="28"/>
-          <w:szCs w:val="28"/>
-        </w:rPr>
-        <w:lastRenderedPageBreak/>
+          <w:sz w:val="27"/>
+          <w:szCs w:val="27"/>
+        </w:rPr>
+      </w:pPr>
+      <w:r>
+        <w:rPr>
+          <w:rFonts w:ascii="Times New Roman" w:hAnsi="Times New Roman" w:cs="Times New Roman"/>
+          <w:sz w:val="27"/>
+          <w:szCs w:val="27"/>
+        </w:rPr>
         <w:t>В результате работы должен быть собран рабочий макет устройства на печатной плате по разработанному входе работы чертежу печатной платы. Электрические соединения между компонентами макета должны быть выполнены только с помощью печатных проводников. Макет должен также полностью отвечать требованиям технического задания, приведенным в п.3 настоящего ТЗ.</w:t>
       </w:r>
     </w:p>
@@ -2964,24 +2699,28 @@
       <w:pPr>
         <w:jc w:val="both"/>
         <w:rPr>
-          <w:szCs w:val="28"/>
-        </w:rPr>
-      </w:pPr>
-      <w:r>
-        <w:rPr>
-          <w:szCs w:val="28"/>
+          <w:sz w:val="27"/>
+          <w:szCs w:val="27"/>
+        </w:rPr>
+      </w:pPr>
+      <w:r>
+        <w:rPr>
+          <w:sz w:val="27"/>
+          <w:szCs w:val="27"/>
         </w:rPr>
         <w:t>Созданный в ходе выполнения курсовой работы макетный образец устройства «</w:t>
       </w:r>
       <w:r>
         <w:rPr>
-          <w:szCs w:val="28"/>
-        </w:rPr>
-        <w:t>Тестер компонентов</w:t>
-      </w:r>
-      <w:r>
-        <w:rPr>
-          <w:szCs w:val="28"/>
+          <w:sz w:val="27"/>
+          <w:szCs w:val="27"/>
+        </w:rPr>
+        <w:t>Тестер компонентов на базе микроконтроллера STM32</w:t>
+      </w:r>
+      <w:r>
+        <w:rPr>
+          <w:sz w:val="27"/>
+          <w:szCs w:val="27"/>
         </w:rPr>
         <w:t>» должен соответствовать требования приведенным в п.3 настоящего ТЗ.</w:t>
       </w:r>
@@ -2989,7 +2728,7 @@
     <w:p>
       <w:pPr>
         <w:pStyle w:val="21"/>
-        <w:spacing w:before="120" w:after="120" w:line="276" w:lineRule="auto"/>
+        <w:spacing w:before="120" w:after="120" w:line="360" w:lineRule="auto"/>
         <w:ind w:left="0" w:firstLine="709"/>
         <w:jc w:val="both"/>
         <w:rPr>
@@ -3033,9 +2772,9 @@
       </w:tblPr>
       <w:tblGrid>
         <w:gridCol w:w="576"/>
-        <w:gridCol w:w="4522"/>
+        <w:gridCol w:w="4664"/>
         <w:gridCol w:w="2835"/>
-        <w:gridCol w:w="1701"/>
+        <w:gridCol w:w="1559"/>
       </w:tblGrid>
       <w:tr>
         <w:trPr>
@@ -3059,15 +2798,15 @@
               <w:jc w:val="center"/>
               <w:rPr>
                 <w:rFonts w:ascii="Times New Roman" w:hAnsi="Times New Roman" w:cs="Times New Roman"/>
-                <w:sz w:val="28"/>
-                <w:szCs w:val="28"/>
+                <w:sz w:val="27"/>
+                <w:szCs w:val="27"/>
               </w:rPr>
             </w:pPr>
             <w:r>
               <w:rPr>
                 <w:rFonts w:ascii="Times New Roman" w:hAnsi="Times New Roman" w:cs="Times New Roman"/>
-                <w:sz w:val="28"/>
-                <w:szCs w:val="28"/>
+                <w:sz w:val="27"/>
+                <w:szCs w:val="27"/>
               </w:rPr>
               <w:t>№ п/п</w:t>
             </w:r>
@@ -3075,7 +2814,7 @@
         </w:tc>
         <w:tc>
           <w:tcPr>
-            <w:tcW w:w="4522" w:type="dxa"/>
+            <w:tcW w:w="4664" w:type="dxa"/>
             <w:tcBorders>
               <w:top w:val="single" w:sz="4" w:space="0" w:color="auto"/>
               <w:left w:val="single" w:sz="4" w:space="0" w:color="auto"/>
@@ -3091,25 +2830,37 @@
               <w:jc w:val="center"/>
               <w:rPr>
                 <w:rFonts w:ascii="Times New Roman" w:hAnsi="Times New Roman" w:cs="Times New Roman"/>
-                <w:sz w:val="28"/>
-                <w:szCs w:val="28"/>
+                <w:sz w:val="27"/>
+                <w:szCs w:val="27"/>
               </w:rPr>
             </w:pPr>
             <w:r>
               <w:rPr>
                 <w:rFonts w:ascii="Times New Roman" w:hAnsi="Times New Roman" w:cs="Times New Roman"/>
-                <w:sz w:val="28"/>
-                <w:szCs w:val="28"/>
+                <w:sz w:val="27"/>
+                <w:szCs w:val="27"/>
               </w:rPr>
-              <w:t xml:space="preserve">Наименование этапа. </w:t>
+              <w:t>Наименование этапа.</w:t>
             </w:r>
+          </w:p>
+          <w:p>
+            <w:pPr>
+              <w:pStyle w:val="92"/>
+              <w:shd w:val="clear" w:color="auto" w:fill="auto"/>
+              <w:spacing w:line="360" w:lineRule="auto"/>
+              <w:jc w:val="center"/>
+              <w:rPr>
+                <w:rFonts w:ascii="Times New Roman" w:hAnsi="Times New Roman" w:cs="Times New Roman"/>
+                <w:sz w:val="27"/>
+                <w:szCs w:val="27"/>
+              </w:rPr>
+            </w:pPr>
             <w:r>
               <w:rPr>
                 <w:rFonts w:ascii="Times New Roman" w:hAnsi="Times New Roman" w:cs="Times New Roman"/>
-                <w:sz w:val="28"/>
-                <w:szCs w:val="28"/>
+                <w:sz w:val="27"/>
+                <w:szCs w:val="27"/>
               </w:rPr>
-              <w:br/>
               <w:t>Содержание работ по этапу</w:t>
             </w:r>
           </w:p>
@@ -3132,15 +2883,15 @@
               <w:jc w:val="center"/>
               <w:rPr>
                 <w:rFonts w:ascii="Times New Roman" w:hAnsi="Times New Roman" w:cs="Times New Roman"/>
-                <w:sz w:val="28"/>
-                <w:szCs w:val="28"/>
+                <w:sz w:val="27"/>
+                <w:szCs w:val="27"/>
               </w:rPr>
             </w:pPr>
             <w:r>
               <w:rPr>
                 <w:rFonts w:ascii="Times New Roman" w:hAnsi="Times New Roman" w:cs="Times New Roman"/>
-                <w:sz w:val="28"/>
-                <w:szCs w:val="28"/>
+                <w:sz w:val="27"/>
+                <w:szCs w:val="27"/>
               </w:rPr>
               <w:t>Выдаваемая научно- техническая продукция</w:t>
             </w:r>
@@ -3148,7 +2899,7 @@
         </w:tc>
         <w:tc>
           <w:tcPr>
-            <w:tcW w:w="1701" w:type="dxa"/>
+            <w:tcW w:w="1559" w:type="dxa"/>
             <w:tcBorders>
               <w:top w:val="single" w:sz="4" w:space="0" w:color="auto"/>
               <w:left w:val="single" w:sz="4" w:space="0" w:color="auto"/>
@@ -3164,15 +2915,15 @@
               <w:jc w:val="center"/>
               <w:rPr>
                 <w:rFonts w:ascii="Times New Roman" w:hAnsi="Times New Roman" w:cs="Times New Roman"/>
-                <w:sz w:val="28"/>
-                <w:szCs w:val="28"/>
+                <w:sz w:val="27"/>
+                <w:szCs w:val="27"/>
               </w:rPr>
             </w:pPr>
             <w:r>
               <w:rPr>
                 <w:rFonts w:ascii="Times New Roman" w:hAnsi="Times New Roman" w:cs="Times New Roman"/>
-                <w:sz w:val="28"/>
-                <w:szCs w:val="28"/>
+                <w:sz w:val="27"/>
+                <w:szCs w:val="27"/>
               </w:rPr>
               <w:t>Сроки выполнения</w:t>
             </w:r>
@@ -3201,16 +2952,16 @@
               <w:spacing w:line="360" w:lineRule="auto"/>
               <w:rPr>
                 <w:rFonts w:ascii="Times New Roman" w:hAnsi="Times New Roman" w:cs="Times New Roman"/>
-                <w:sz w:val="28"/>
-                <w:szCs w:val="28"/>
+                <w:sz w:val="27"/>
+                <w:szCs w:val="27"/>
                 <w:lang w:val="en-US"/>
               </w:rPr>
             </w:pPr>
             <w:r>
               <w:rPr>
                 <w:rFonts w:ascii="Times New Roman" w:hAnsi="Times New Roman" w:cs="Times New Roman"/>
-                <w:sz w:val="28"/>
-                <w:szCs w:val="28"/>
+                <w:sz w:val="27"/>
+                <w:szCs w:val="27"/>
               </w:rPr>
               <w:t>1</w:t>
             </w:r>
@@ -3218,7 +2969,7 @@
         </w:tc>
         <w:tc>
           <w:tcPr>
-            <w:tcW w:w="4522" w:type="dxa"/>
+            <w:tcW w:w="4664" w:type="dxa"/>
             <w:tcBorders>
               <w:top w:val="single" w:sz="4" w:space="0" w:color="auto"/>
               <w:left w:val="single" w:sz="4" w:space="0" w:color="auto"/>
@@ -3235,16 +2986,15 @@
               <w:jc w:val="left"/>
               <w:rPr>
                 <w:rFonts w:ascii="Times New Roman" w:hAnsi="Times New Roman" w:cs="Times New Roman"/>
-                <w:sz w:val="28"/>
-                <w:szCs w:val="28"/>
-                <w:lang w:val="en-US"/>
+                <w:sz w:val="27"/>
+                <w:szCs w:val="27"/>
               </w:rPr>
             </w:pPr>
             <w:r>
               <w:rPr>
                 <w:rFonts w:ascii="Times New Roman" w:hAnsi="Times New Roman" w:cs="Times New Roman"/>
-                <w:sz w:val="28"/>
-                <w:szCs w:val="28"/>
+                <w:sz w:val="27"/>
+                <w:szCs w:val="27"/>
               </w:rPr>
               <w:t>ТЕОРЕТИЧЕСКАЯ И ЭКСПЕРИМЕНТАЛЬНАЯ РАБОТА.</w:t>
             </w:r>
@@ -3257,23 +3007,23 @@
               <w:jc w:val="left"/>
               <w:rPr>
                 <w:rFonts w:ascii="Times New Roman" w:hAnsi="Times New Roman" w:cs="Times New Roman"/>
-                <w:sz w:val="28"/>
-                <w:szCs w:val="28"/>
+                <w:sz w:val="27"/>
+                <w:szCs w:val="27"/>
               </w:rPr>
             </w:pPr>
             <w:r>
               <w:rPr>
                 <w:rFonts w:ascii="Times New Roman" w:hAnsi="Times New Roman" w:cs="Times New Roman"/>
-                <w:sz w:val="28"/>
-                <w:szCs w:val="28"/>
+                <w:sz w:val="27"/>
+                <w:szCs w:val="27"/>
               </w:rPr>
               <w:t>Содержание этапа</w:t>
             </w:r>
             <w:r>
               <w:rPr>
                 <w:rFonts w:ascii="Times New Roman" w:hAnsi="Times New Roman" w:cs="Times New Roman"/>
-                <w:sz w:val="28"/>
-                <w:szCs w:val="28"/>
+                <w:sz w:val="27"/>
+                <w:szCs w:val="27"/>
               </w:rPr>
               <w:t>:</w:t>
             </w:r>
@@ -3291,15 +3041,15 @@
               <w:jc w:val="left"/>
               <w:rPr>
                 <w:rFonts w:ascii="Times New Roman" w:hAnsi="Times New Roman" w:cs="Times New Roman"/>
-                <w:sz w:val="28"/>
-                <w:szCs w:val="28"/>
+                <w:sz w:val="27"/>
+                <w:szCs w:val="27"/>
               </w:rPr>
             </w:pPr>
             <w:r>
               <w:rPr>
                 <w:rFonts w:ascii="Times New Roman" w:hAnsi="Times New Roman" w:cs="Times New Roman"/>
-                <w:sz w:val="28"/>
-                <w:szCs w:val="28"/>
+                <w:sz w:val="27"/>
+                <w:szCs w:val="27"/>
               </w:rPr>
               <w:t>Техническое задание и календарный план</w:t>
             </w:r>
@@ -3317,16 +3067,17 @@
               <w:jc w:val="left"/>
               <w:rPr>
                 <w:rFonts w:ascii="Times New Roman" w:hAnsi="Times New Roman" w:cs="Times New Roman"/>
-                <w:sz w:val="28"/>
-                <w:szCs w:val="28"/>
+                <w:sz w:val="27"/>
+                <w:szCs w:val="27"/>
               </w:rPr>
             </w:pPr>
             <w:r>
               <w:rPr>
                 <w:rFonts w:ascii="Times New Roman" w:hAnsi="Times New Roman" w:cs="Times New Roman"/>
-                <w:sz w:val="28"/>
-                <w:szCs w:val="28"/>
+                <w:sz w:val="27"/>
+                <w:szCs w:val="27"/>
               </w:rPr>
+              <w:lastRenderedPageBreak/>
               <w:t>Расширенное техническое задание</w:t>
             </w:r>
           </w:p>
@@ -3343,15 +3094,15 @@
               <w:jc w:val="left"/>
               <w:rPr>
                 <w:rFonts w:ascii="Times New Roman" w:hAnsi="Times New Roman" w:cs="Times New Roman"/>
-                <w:sz w:val="28"/>
-                <w:szCs w:val="28"/>
+                <w:sz w:val="27"/>
+                <w:szCs w:val="27"/>
               </w:rPr>
             </w:pPr>
             <w:r>
               <w:rPr>
                 <w:rFonts w:ascii="Times New Roman" w:hAnsi="Times New Roman" w:cs="Times New Roman"/>
-                <w:sz w:val="28"/>
-                <w:szCs w:val="28"/>
+                <w:sz w:val="27"/>
+                <w:szCs w:val="27"/>
               </w:rPr>
               <w:t>Схема электрическая структурная (Э1)</w:t>
             </w:r>
@@ -3369,15 +3120,15 @@
               <w:jc w:val="left"/>
               <w:rPr>
                 <w:rFonts w:ascii="Times New Roman" w:hAnsi="Times New Roman" w:cs="Times New Roman"/>
-                <w:sz w:val="28"/>
-                <w:szCs w:val="28"/>
+                <w:sz w:val="27"/>
+                <w:szCs w:val="27"/>
               </w:rPr>
             </w:pPr>
             <w:r>
               <w:rPr>
                 <w:rFonts w:ascii="Times New Roman" w:hAnsi="Times New Roman" w:cs="Times New Roman"/>
-                <w:sz w:val="28"/>
-                <w:szCs w:val="28"/>
+                <w:sz w:val="27"/>
+                <w:szCs w:val="27"/>
               </w:rPr>
               <w:t>Схема электрическая функциональная (Э2)</w:t>
             </w:r>
@@ -3395,15 +3146,15 @@
               <w:jc w:val="left"/>
               <w:rPr>
                 <w:rFonts w:ascii="Times New Roman" w:hAnsi="Times New Roman" w:cs="Times New Roman"/>
-                <w:sz w:val="28"/>
-                <w:szCs w:val="28"/>
+                <w:sz w:val="27"/>
+                <w:szCs w:val="27"/>
               </w:rPr>
             </w:pPr>
             <w:r>
               <w:rPr>
                 <w:rFonts w:ascii="Times New Roman" w:hAnsi="Times New Roman" w:cs="Times New Roman"/>
-                <w:sz w:val="28"/>
-                <w:szCs w:val="28"/>
+                <w:sz w:val="27"/>
+                <w:szCs w:val="27"/>
               </w:rPr>
               <w:t>Результаты моделирование устройства</w:t>
             </w:r>
@@ -3421,15 +3172,15 @@
               <w:jc w:val="left"/>
               <w:rPr>
                 <w:rFonts w:ascii="Times New Roman" w:hAnsi="Times New Roman" w:cs="Times New Roman"/>
-                <w:sz w:val="28"/>
-                <w:szCs w:val="28"/>
+                <w:sz w:val="27"/>
+                <w:szCs w:val="27"/>
               </w:rPr>
             </w:pPr>
             <w:r>
               <w:rPr>
                 <w:rFonts w:ascii="Times New Roman" w:hAnsi="Times New Roman" w:cs="Times New Roman"/>
-                <w:sz w:val="28"/>
-                <w:szCs w:val="28"/>
+                <w:sz w:val="27"/>
+                <w:szCs w:val="27"/>
               </w:rPr>
               <w:t>Схема электрическая принципиальная и перечень элементов</w:t>
             </w:r>
@@ -3447,17 +3198,16 @@
               <w:jc w:val="left"/>
               <w:rPr>
                 <w:rFonts w:ascii="Times New Roman" w:hAnsi="Times New Roman" w:cs="Times New Roman"/>
-                <w:sz w:val="28"/>
-                <w:szCs w:val="28"/>
+                <w:sz w:val="27"/>
+                <w:szCs w:val="27"/>
               </w:rPr>
             </w:pPr>
             <w:r>
               <w:rPr>
                 <w:rFonts w:ascii="Times New Roman" w:hAnsi="Times New Roman" w:cs="Times New Roman"/>
-                <w:sz w:val="28"/>
-                <w:szCs w:val="28"/>
+                <w:sz w:val="27"/>
+                <w:szCs w:val="27"/>
               </w:rPr>
-              <w:lastRenderedPageBreak/>
               <w:t>Чертеж печатной платы</w:t>
             </w:r>
           </w:p>
@@ -3474,15 +3224,15 @@
               <w:jc w:val="left"/>
               <w:rPr>
                 <w:rFonts w:ascii="Times New Roman" w:hAnsi="Times New Roman" w:cs="Times New Roman"/>
-                <w:sz w:val="28"/>
-                <w:szCs w:val="28"/>
+                <w:sz w:val="27"/>
+                <w:szCs w:val="27"/>
               </w:rPr>
             </w:pPr>
             <w:r>
               <w:rPr>
                 <w:rFonts w:ascii="Times New Roman" w:hAnsi="Times New Roman" w:cs="Times New Roman"/>
-                <w:sz w:val="28"/>
-                <w:szCs w:val="28"/>
+                <w:sz w:val="27"/>
+                <w:szCs w:val="27"/>
               </w:rPr>
               <w:t>Сборочный чертеж и спецификация</w:t>
             </w:r>
@@ -3500,15 +3250,15 @@
               <w:jc w:val="left"/>
               <w:rPr>
                 <w:rFonts w:ascii="Times New Roman" w:hAnsi="Times New Roman" w:cs="Times New Roman"/>
-                <w:sz w:val="28"/>
-                <w:szCs w:val="28"/>
+                <w:sz w:val="27"/>
+                <w:szCs w:val="27"/>
               </w:rPr>
             </w:pPr>
             <w:r>
               <w:rPr>
                 <w:rFonts w:ascii="Times New Roman" w:hAnsi="Times New Roman" w:cs="Times New Roman"/>
-                <w:sz w:val="28"/>
-                <w:szCs w:val="28"/>
+                <w:sz w:val="27"/>
+                <w:szCs w:val="27"/>
               </w:rPr>
               <w:t xml:space="preserve">Сборка устройства и его экспериментальное исследование </w:t>
             </w:r>
@@ -3526,25 +3276,17 @@
               <w:jc w:val="left"/>
               <w:rPr>
                 <w:rFonts w:ascii="Times New Roman" w:hAnsi="Times New Roman" w:cs="Times New Roman"/>
-                <w:sz w:val="28"/>
-                <w:szCs w:val="28"/>
+                <w:sz w:val="27"/>
+                <w:szCs w:val="27"/>
               </w:rPr>
             </w:pPr>
             <w:r>
               <w:rPr>
                 <w:rFonts w:ascii="Times New Roman" w:hAnsi="Times New Roman" w:cs="Times New Roman"/>
-                <w:sz w:val="28"/>
-                <w:szCs w:val="28"/>
+                <w:sz w:val="27"/>
+                <w:szCs w:val="27"/>
               </w:rPr>
-              <w:t>РПЗ и демонстрационные</w:t>
-            </w:r>
-            <w:r>
-              <w:rPr>
-                <w:rFonts w:ascii="Times New Roman" w:hAnsi="Times New Roman" w:cs="Times New Roman"/>
-                <w:sz w:val="28"/>
-                <w:szCs w:val="28"/>
-              </w:rPr>
-              <w:t xml:space="preserve"> плакаты</w:t>
+              <w:t>РПЗ и демонстрационные плакаты</w:t>
             </w:r>
           </w:p>
         </w:tc>
@@ -3566,15 +3308,15 @@
               <w:spacing w:line="360" w:lineRule="auto"/>
               <w:rPr>
                 <w:rFonts w:ascii="Times New Roman" w:hAnsi="Times New Roman" w:cs="Times New Roman"/>
-                <w:sz w:val="28"/>
-                <w:szCs w:val="28"/>
+                <w:sz w:val="27"/>
+                <w:szCs w:val="27"/>
               </w:rPr>
             </w:pPr>
             <w:r>
               <w:rPr>
                 <w:rFonts w:ascii="Times New Roman" w:hAnsi="Times New Roman" w:cs="Times New Roman"/>
-                <w:sz w:val="28"/>
-                <w:szCs w:val="28"/>
+                <w:sz w:val="27"/>
+                <w:szCs w:val="27"/>
               </w:rPr>
               <w:lastRenderedPageBreak/>
               <w:t>Согласно п.6 настоящего ТЗ</w:t>
@@ -3587,15 +3329,15 @@
               <w:spacing w:line="360" w:lineRule="auto"/>
               <w:rPr>
                 <w:rFonts w:ascii="Times New Roman" w:hAnsi="Times New Roman" w:cs="Times New Roman"/>
-                <w:sz w:val="28"/>
-                <w:szCs w:val="28"/>
+                <w:sz w:val="27"/>
+                <w:szCs w:val="27"/>
               </w:rPr>
             </w:pPr>
           </w:p>
         </w:tc>
         <w:tc>
           <w:tcPr>
-            <w:tcW w:w="1701" w:type="dxa"/>
+            <w:tcW w:w="1559" w:type="dxa"/>
             <w:tcBorders>
               <w:top w:val="single" w:sz="4" w:space="0" w:color="auto"/>
               <w:left w:val="single" w:sz="4" w:space="0" w:color="auto"/>
@@ -3608,18 +3350,18 @@
             <w:pPr>
               <w:pStyle w:val="52"/>
               <w:shd w:val="clear" w:color="auto" w:fill="auto"/>
-              <w:spacing w:line="276" w:lineRule="auto"/>
+              <w:spacing w:line="360" w:lineRule="auto"/>
               <w:rPr>
                 <w:rFonts w:ascii="Times New Roman" w:hAnsi="Times New Roman" w:cs="Times New Roman"/>
-                <w:sz w:val="28"/>
-                <w:szCs w:val="28"/>
+                <w:sz w:val="27"/>
+                <w:szCs w:val="27"/>
               </w:rPr>
             </w:pPr>
             <w:r>
               <w:rPr>
                 <w:rFonts w:ascii="Times New Roman" w:hAnsi="Times New Roman" w:cs="Times New Roman"/>
-                <w:sz w:val="28"/>
-                <w:szCs w:val="28"/>
+                <w:sz w:val="27"/>
+                <w:szCs w:val="27"/>
               </w:rPr>
               <w:t>01.05.2025</w:t>
             </w:r>
@@ -3630,7 +3372,7 @@
     <w:p>
       <w:pPr>
         <w:pStyle w:val="21"/>
-        <w:spacing w:before="120" w:after="120" w:line="276" w:lineRule="auto"/>
+        <w:spacing w:before="120" w:after="120" w:line="360" w:lineRule="auto"/>
         <w:ind w:left="0" w:firstLine="709"/>
         <w:jc w:val="both"/>
         <w:rPr>
@@ -4023,14 +3765,6 @@
         </w:rPr>
         <w:t>Перечень элементов на электрическую принципиальную схему (ПЭ3).</w:t>
       </w:r>
-      <w:r>
-        <w:rPr>
-          <w:rFonts w:ascii="Times New Roman" w:hAnsi="Times New Roman" w:cs="Times New Roman"/>
-          <w:sz w:val="28"/>
-          <w:szCs w:val="28"/>
-        </w:rPr>
-        <w:tab/>
-      </w:r>
     </w:p>
     <w:p>
       <w:pPr>
@@ -4054,6 +3788,7 @@
           <w:sz w:val="28"/>
           <w:szCs w:val="28"/>
         </w:rPr>
+        <w:lastRenderedPageBreak/>
         <w:t>Расчетно-пояснительная записка (РПЗ).</w:t>
       </w:r>
     </w:p>
@@ -4080,20 +3815,13 @@
         <w:rPr>
           <w:szCs w:val="28"/>
         </w:rPr>
-        <w:t xml:space="preserve">). Кроме этого, РПЗ должна содержать максимально подробное описание примененных схемотехнических и конструкторских решений, а также в ней должны быть представлены все расчеты, подтверждающие правильность выбранных студентом подходов и решений. РПЗ должна быть предоставлена в </w:t>
-      </w:r>
-      <w:r>
-        <w:rPr>
-          <w:szCs w:val="28"/>
-        </w:rPr>
-        <w:lastRenderedPageBreak/>
-        <w:t>электронном виде (в формате Office Open XML) и на бумажном носителе (в одном экземпляре).</w:t>
+        <w:t>). Кроме этого, РПЗ должна содержать максимально подробное описание примененных схемотехнических и конструкторских решений, а также в ней должны быть представлены все расчеты, подтверждающие правильность выбранных студентом подходов и решений. РПЗ должна быть предоставлена в электронном виде (в формате Office Open XML) и на бумажном носителе (в одном экземпляре).</w:t>
       </w:r>
     </w:p>
     <w:p>
       <w:pPr>
         <w:pStyle w:val="21"/>
-        <w:spacing w:before="120" w:after="120" w:line="276" w:lineRule="auto"/>
+        <w:spacing w:before="120" w:after="120" w:line="360" w:lineRule="auto"/>
         <w:ind w:left="0" w:firstLine="709"/>
         <w:jc w:val="both"/>
         <w:rPr>
@@ -4152,7 +3880,7 @@
     <w:p>
       <w:pPr>
         <w:pStyle w:val="21"/>
-        <w:spacing w:before="120" w:after="120" w:line="276" w:lineRule="auto"/>
+        <w:spacing w:before="120" w:after="120" w:line="360" w:lineRule="auto"/>
         <w:ind w:left="0" w:firstLine="709"/>
         <w:jc w:val="both"/>
         <w:rPr>
@@ -4195,7 +3923,7 @@
     <w:p>
       <w:pPr>
         <w:pStyle w:val="21"/>
-        <w:spacing w:before="120" w:after="120" w:line="276" w:lineRule="auto"/>
+        <w:spacing w:before="120" w:after="120" w:line="360" w:lineRule="auto"/>
         <w:ind w:left="0" w:firstLine="709"/>
         <w:jc w:val="both"/>
         <w:rPr>
@@ -4273,7 +4001,7 @@
     <w:p>
       <w:pPr>
         <w:pStyle w:val="21"/>
-        <w:spacing w:before="120" w:after="120" w:line="276" w:lineRule="auto"/>
+        <w:spacing w:before="120" w:after="120" w:line="360" w:lineRule="auto"/>
         <w:ind w:left="0" w:firstLine="709"/>
         <w:jc w:val="both"/>
         <w:rPr>
@@ -4330,6 +4058,7 @@
           <w:p>
             <w:pPr>
               <w:pStyle w:val="aa"/>
+              <w:spacing w:line="360" w:lineRule="auto"/>
             </w:pPr>
           </w:p>
         </w:tc>
@@ -4340,6 +4069,7 @@
           <w:p>
             <w:pPr>
               <w:pStyle w:val="aa"/>
+              <w:spacing w:line="360" w:lineRule="auto"/>
             </w:pPr>
           </w:p>
         </w:tc>
@@ -4353,6 +4083,7 @@
           <w:p>
             <w:pPr>
               <w:pStyle w:val="aa"/>
+              <w:spacing w:line="360" w:lineRule="auto"/>
             </w:pPr>
           </w:p>
         </w:tc>
@@ -4365,6 +4096,7 @@
           <w:p>
             <w:pPr>
               <w:pStyle w:val="aa"/>
+              <w:spacing w:line="360" w:lineRule="auto"/>
               <w:jc w:val="center"/>
               <w:rPr>
                 <w:color w:val="808080" w:themeColor="background1" w:themeShade="80"/>
@@ -4381,6 +4113,7 @@
           <w:p>
             <w:pPr>
               <w:pStyle w:val="aa"/>
+              <w:spacing w:line="360" w:lineRule="auto"/>
               <w:jc w:val="center"/>
               <w:rPr>
                 <w:color w:val="808080" w:themeColor="background1" w:themeShade="80"/>
@@ -4400,6 +4133,7 @@
           <w:p>
             <w:pPr>
               <w:pStyle w:val="aa"/>
+              <w:spacing w:line="360" w:lineRule="auto"/>
               <w:jc w:val="center"/>
               <w:rPr>
                 <w:sz w:val="20"/>
@@ -4417,6 +4151,7 @@
           <w:p>
             <w:pPr>
               <w:pStyle w:val="aa"/>
+              <w:spacing w:line="360" w:lineRule="auto"/>
               <w:jc w:val="center"/>
               <w:rPr>
                 <w:sz w:val="20"/>
@@ -4434,6 +4169,7 @@
           <w:p>
             <w:pPr>
               <w:pStyle w:val="aa"/>
+              <w:spacing w:line="360" w:lineRule="auto"/>
               <w:jc w:val="right"/>
             </w:pPr>
           </w:p>
@@ -4445,6 +4181,7 @@
           <w:p>
             <w:pPr>
               <w:pStyle w:val="aa"/>
+              <w:spacing w:line="360" w:lineRule="auto"/>
             </w:pPr>
           </w:p>
         </w:tc>
@@ -4458,6 +4195,7 @@
           <w:p>
             <w:pPr>
               <w:pStyle w:val="aa"/>
+              <w:spacing w:line="360" w:lineRule="auto"/>
               <w:jc w:val="right"/>
             </w:pPr>
           </w:p>
@@ -4471,6 +4209,7 @@
           <w:p>
             <w:pPr>
               <w:pStyle w:val="aa"/>
+              <w:spacing w:line="360" w:lineRule="auto"/>
               <w:jc w:val="center"/>
               <w:rPr>
                 <w:color w:val="808080" w:themeColor="background1" w:themeShade="80"/>
@@ -4487,6 +4226,7 @@
           <w:p>
             <w:pPr>
               <w:pStyle w:val="aa"/>
+              <w:spacing w:line="360" w:lineRule="auto"/>
               <w:jc w:val="center"/>
               <w:rPr>
                 <w:color w:val="808080" w:themeColor="background1" w:themeShade="80"/>
@@ -4506,6 +4246,7 @@
           <w:p>
             <w:pPr>
               <w:pStyle w:val="aa"/>
+              <w:spacing w:line="360" w:lineRule="auto"/>
               <w:jc w:val="center"/>
               <w:rPr>
                 <w:sz w:val="20"/>
@@ -4530,6 +4271,7 @@
           <w:p>
             <w:pPr>
               <w:pStyle w:val="aa"/>
+              <w:spacing w:line="360" w:lineRule="auto"/>
             </w:pPr>
           </w:p>
         </w:tc>
@@ -4540,6 +4282,7 @@
           <w:p>
             <w:pPr>
               <w:pStyle w:val="aa"/>
+              <w:spacing w:line="360" w:lineRule="auto"/>
             </w:pPr>
           </w:p>
         </w:tc>
@@ -4550,6 +4293,7 @@
           <w:p>
             <w:pPr>
               <w:pStyle w:val="aa"/>
+              <w:spacing w:line="360" w:lineRule="auto"/>
             </w:pPr>
           </w:p>
         </w:tc>
@@ -4562,6 +4306,7 @@
           <w:p>
             <w:pPr>
               <w:pStyle w:val="aa"/>
+              <w:spacing w:line="360" w:lineRule="auto"/>
             </w:pPr>
           </w:p>
         </w:tc>
@@ -4572,6 +4317,7 @@
           <w:p>
             <w:pPr>
               <w:pStyle w:val="aa"/>
+              <w:spacing w:line="360" w:lineRule="auto"/>
             </w:pPr>
           </w:p>
         </w:tc>
@@ -4582,6 +4328,7 @@
           <w:p>
             <w:pPr>
               <w:pStyle w:val="aa"/>
+              <w:spacing w:line="360" w:lineRule="auto"/>
             </w:pPr>
             <w:r>
               <w:t>«__</w:t>
@@ -4640,6 +4387,7 @@
         <w:separator/>
       </w:r>
     </w:p>
+    <w:p/>
   </w:endnote>
   <w:endnote w:type="continuationSeparator" w:id="0">
     <w:p>
@@ -4647,6 +4395,7 @@
         <w:continuationSeparator/>
       </w:r>
     </w:p>
+    <w:p/>
   </w:endnote>
 </w:endnotes>
 </file>
@@ -4706,14 +4455,6 @@
       </w:p>
     </w:sdtContent>
   </w:sdt>
-  <w:p>
-    <w:pPr>
-      <w:pStyle w:val="a7"/>
-      <w:rPr>
-        <w:rFonts w:ascii="Times New Roman" w:hAnsi="Times New Roman" w:cs="Times New Roman"/>
-      </w:rPr>
-    </w:pPr>
-  </w:p>
 </w:ftr>
 </file>
 
@@ -4765,6 +4506,7 @@
         <w:separator/>
       </w:r>
     </w:p>
+    <w:p/>
   </w:footnote>
   <w:footnote w:type="continuationSeparator" w:id="0">
     <w:p>
@@ -4772,6 +4514,7 @@
         <w:continuationSeparator/>
       </w:r>
     </w:p>
+    <w:p/>
   </w:footnote>
 </w:footnotes>
 </file>
@@ -11926,11 +11669,13 @@
   </w:compat>
   <w:rsids>
     <w:rsidRoot w:val="00371083"/>
+    <w:rsid w:val="00025FC6"/>
     <w:rsid w:val="00076CBD"/>
     <w:rsid w:val="000834F3"/>
     <w:rsid w:val="000D4923"/>
     <w:rsid w:val="00151FBF"/>
     <w:rsid w:val="001663B8"/>
+    <w:rsid w:val="001C7428"/>
     <w:rsid w:val="00223120"/>
     <w:rsid w:val="0024737B"/>
     <w:rsid w:val="002876D1"/>

</xml_diff>

<commit_message>
Fix title to mcu fullname
</commit_message>
<xml_diff>
--- a/docs/Word/RTZ.docx
+++ b/docs/Word/RTZ.docx
@@ -496,15 +496,7 @@
                 <w:sz w:val="36"/>
                 <w:szCs w:val="36"/>
               </w:rPr>
-              <w:t>Тестер</w:t>
-            </w:r>
-            <w:r>
-              <w:rPr>
-                <w:color w:val="000000" w:themeColor="text1"/>
-                <w:sz w:val="36"/>
-                <w:szCs w:val="36"/>
-              </w:rPr>
-              <w:t xml:space="preserve"> компонентов на базе микроконтроллера STM32</w:t>
+              <w:t>Тестер компонентов на базе микроконтроллера STM32F103C8T6</w:t>
             </w:r>
             <w:r>
               <w:rPr>
@@ -874,6 +866,7 @@
           <w:b/>
           <w:szCs w:val="28"/>
         </w:rPr>
+        <w:lastRenderedPageBreak/>
         <w:br w:type="page"/>
       </w:r>
     </w:p>
@@ -933,14 +926,7 @@
           <w:sz w:val="27"/>
           <w:szCs w:val="27"/>
         </w:rPr>
-        <w:t>Тестер</w:t>
-      </w:r>
-      <w:r>
-        <w:rPr>
-          <w:sz w:val="27"/>
-          <w:szCs w:val="27"/>
-        </w:rPr>
-        <w:t xml:space="preserve"> компонентов на базе микроконтроллера STM32</w:t>
+        <w:t>Тестер компонентов на базе микроконтроллера STM32F103C8T6</w:t>
       </w:r>
       <w:r>
         <w:rPr>
@@ -1093,7 +1079,7 @@
           <w:sz w:val="27"/>
           <w:szCs w:val="27"/>
         </w:rPr>
-        <w:t>Тестер компонентов на базе микроконтроллера STM32</w:t>
+        <w:t>Тестер компонентов на базе микроконтроллера STM32F103C8T6</w:t>
       </w:r>
       <w:r>
         <w:rPr>
@@ -1283,7 +1269,7 @@
           <w:sz w:val="27"/>
           <w:szCs w:val="27"/>
         </w:rPr>
-        <w:t>Тестер компонентов на базе микроконтроллера STM32</w:t>
+        <w:t>Тестер компонентов на базе микроконтроллера STM32F103C8T6</w:t>
       </w:r>
       <w:r>
         <w:rPr>
@@ -1328,7 +1314,7 @@
           <w:sz w:val="27"/>
           <w:szCs w:val="27"/>
         </w:rPr>
-        <w:t>Тестер компонентов на базе микроконтроллера STM32</w:t>
+        <w:t>Тестер компонентов на базе микроконтроллера STM32F103C8T6</w:t>
       </w:r>
       <w:r>
         <w:rPr>
@@ -1373,7 +1359,7 @@
           <w:sz w:val="27"/>
           <w:szCs w:val="27"/>
         </w:rPr>
-        <w:t>Тестер компонентов на базе микроконтроллера STM32</w:t>
+        <w:t>Тестер компонентов на базе микроконтроллера STM32F103C8T6</w:t>
       </w:r>
       <w:r>
         <w:rPr>
@@ -1418,7 +1404,7 @@
           <w:sz w:val="27"/>
           <w:szCs w:val="27"/>
         </w:rPr>
-        <w:t>Тестер компонентов на базе микроконтроллера STM32</w:t>
+        <w:t>Тестер компонентов на базе микроконтроллера STM32F103C8T6</w:t>
       </w:r>
       <w:r>
         <w:rPr>
@@ -1473,6 +1459,7 @@
           <w:sz w:val="28"/>
           <w:szCs w:val="28"/>
         </w:rPr>
+        <w:lastRenderedPageBreak/>
         <w:t xml:space="preserve">3 </w:t>
       </w:r>
       <w:r>
@@ -1497,7 +1484,6 @@
           <w:sz w:val="27"/>
           <w:szCs w:val="27"/>
         </w:rPr>
-        <w:lastRenderedPageBreak/>
         <w:t xml:space="preserve">3.1 </w:t>
       </w:r>
       <w:r>
@@ -1562,21 +1548,7 @@
           <w:sz w:val="27"/>
           <w:szCs w:val="27"/>
         </w:rPr>
-        <w:t>Тест</w:t>
-      </w:r>
-      <w:r>
-        <w:rPr>
-          <w:sz w:val="27"/>
-          <w:szCs w:val="27"/>
-        </w:rPr>
-        <w:t>е</w:t>
-      </w:r>
-      <w:r>
-        <w:rPr>
-          <w:sz w:val="27"/>
-          <w:szCs w:val="27"/>
-        </w:rPr>
-        <w:t>р компонентов на базе микроконтроллера STM32</w:t>
+        <w:t>Тестер компонентов на базе микроконтроллера STM32F103C8T6</w:t>
       </w:r>
       <w:r>
         <w:rPr>
@@ -2397,6 +2369,7 @@
           <w:sz w:val="27"/>
           <w:szCs w:val="27"/>
         </w:rPr>
+        <w:lastRenderedPageBreak/>
         <w:t>В ходе выполнения курсовой работы проведение проверки патентной чистоты разработанного подхода не требуется.</w:t>
       </w:r>
     </w:p>
@@ -2418,7 +2391,6 @@
           <w:sz w:val="27"/>
           <w:szCs w:val="27"/>
         </w:rPr>
-        <w:lastRenderedPageBreak/>
         <w:t xml:space="preserve">Государственная регистрация программы для ЭВМ в едином реестре программного обеспечения </w:t>
       </w:r>
       <w:proofErr w:type="spellStart"/>
@@ -2533,7 +2505,7 @@
           <w:szCs w:val="27"/>
           <w:lang w:eastAsia="ru-RU"/>
         </w:rPr>
-        <w:t>Тестер компонентов на базе микроконтроллера STM32</w:t>
+        <w:t>Тестер компонентов на базе микроконтроллера STM32F103C8T6</w:t>
       </w:r>
       <w:r>
         <w:rPr>
@@ -2715,7 +2687,7 @@
           <w:sz w:val="27"/>
           <w:szCs w:val="27"/>
         </w:rPr>
-        <w:t>Тестер компонентов на базе микроконтроллера STM32</w:t>
+        <w:t>Тестер компонентов на базе микроконтроллера STM32F103C8T6</w:t>
       </w:r>
       <w:r>
         <w:rPr>
@@ -3051,6 +3023,7 @@
                 <w:sz w:val="27"/>
                 <w:szCs w:val="27"/>
               </w:rPr>
+              <w:lastRenderedPageBreak/>
               <w:t>Техническое задание и календарный план</w:t>
             </w:r>
           </w:p>
@@ -3077,7 +3050,6 @@
                 <w:sz w:val="27"/>
                 <w:szCs w:val="27"/>
               </w:rPr>
-              <w:lastRenderedPageBreak/>
               <w:t>Расширенное техническое задание</w:t>
             </w:r>
           </w:p>
@@ -3763,6 +3735,7 @@
           <w:sz w:val="28"/>
           <w:szCs w:val="28"/>
         </w:rPr>
+        <w:lastRenderedPageBreak/>
         <w:t>Перечень элементов на электрическую принципиальную схему (ПЭ3).</w:t>
       </w:r>
     </w:p>
@@ -3788,7 +3761,6 @@
           <w:sz w:val="28"/>
           <w:szCs w:val="28"/>
         </w:rPr>
-        <w:lastRenderedPageBreak/>
         <w:t>Расчетно-пояснительная записка (РПЗ).</w:t>
       </w:r>
     </w:p>
@@ -11673,6 +11645,7 @@
     <w:rsid w:val="00076CBD"/>
     <w:rsid w:val="000834F3"/>
     <w:rsid w:val="000D4923"/>
+    <w:rsid w:val="00151262"/>
     <w:rsid w:val="00151FBF"/>
     <w:rsid w:val="001663B8"/>
     <w:rsid w:val="001C7428"/>
@@ -11682,6 +11655,7 @@
     <w:rsid w:val="00371083"/>
     <w:rsid w:val="004F2100"/>
     <w:rsid w:val="00507593"/>
+    <w:rsid w:val="00514F0B"/>
     <w:rsid w:val="005A5094"/>
     <w:rsid w:val="0063560B"/>
     <w:rsid w:val="0075000B"/>

</xml_diff>